<commit_message>
Revert last 4 commits
</commit_message>
<xml_diff>
--- a/request-management-api/request_api/receipt_templates/cfr_fee_invoice.docx
+++ b/request-management-api/request_api/receipt_templates/cfr_fee_invoice.docx
@@ -196,36 +196,16 @@
                 <w:sz w:val="18"/>
                 <w:szCs w:val="18"/>
               </w:rPr>
-              <w:t>{</w:t>
-            </w:r>
-            <w:proofErr w:type="spellStart"/>
-            <w:proofErr w:type="gramStart"/>
-            <w:r>
-              <w:rPr>
-                <w:rFonts w:ascii="BC Sans" w:eastAsia="BC Sans" w:hAnsi="BC Sans" w:cs="BC Sans"/>
-                <w:sz w:val="18"/>
-                <w:szCs w:val="18"/>
-              </w:rPr>
-              <w:t>d.</w:t>
-            </w:r>
-            <w:r>
-              <w:rPr>
-                <w:rFonts w:ascii="BC Sans" w:eastAsia="BC Sans" w:hAnsi="BC Sans" w:cs="BC Sans"/>
-                <w:sz w:val="18"/>
-                <w:szCs w:val="18"/>
-              </w:rPr>
-              <w:t>applicant</w:t>
-            </w:r>
-            <w:proofErr w:type="gramEnd"/>
-            <w:r>
-              <w:rPr>
-                <w:rFonts w:ascii="BC Sans" w:eastAsia="BC Sans" w:hAnsi="BC Sans" w:cs="BC Sans"/>
-                <w:sz w:val="18"/>
-                <w:szCs w:val="18"/>
-              </w:rPr>
-              <w:t>_name</w:t>
-            </w:r>
-            <w:proofErr w:type="spellEnd"/>
+              <w:t>{d.</w:t>
+            </w:r>
+            <w:r>
+              <w:rPr>
+                <w:rFonts w:ascii="BC Sans" w:eastAsia="BC Sans" w:hAnsi="BC Sans" w:cs="BC Sans"/>
+                <w:sz w:val="18"/>
+                <w:szCs w:val="18"/>
+              </w:rPr>
+              <w:t>applicant_name</w:t>
+            </w:r>
             <w:r>
               <w:rPr>
                 <w:rFonts w:ascii="BC Sans" w:eastAsia="BC Sans" w:hAnsi="BC Sans" w:cs="BC Sans"/>
@@ -272,36 +252,16 @@
                 <w:sz w:val="18"/>
                 <w:szCs w:val="18"/>
               </w:rPr>
-              <w:t>{</w:t>
-            </w:r>
-            <w:proofErr w:type="spellStart"/>
-            <w:proofErr w:type="gramStart"/>
-            <w:r>
-              <w:rPr>
-                <w:rFonts w:ascii="BC Sans" w:eastAsia="BC Sans" w:hAnsi="BC Sans" w:cs="BC Sans"/>
-                <w:sz w:val="18"/>
-                <w:szCs w:val="18"/>
-              </w:rPr>
-              <w:t>d.</w:t>
-            </w:r>
-            <w:r>
-              <w:rPr>
-                <w:rFonts w:ascii="BC Sans" w:eastAsia="BC Sans" w:hAnsi="BC Sans" w:cs="BC Sans"/>
-                <w:sz w:val="18"/>
-                <w:szCs w:val="18"/>
-              </w:rPr>
-              <w:t>applicant</w:t>
-            </w:r>
-            <w:proofErr w:type="gramEnd"/>
-            <w:r>
-              <w:rPr>
-                <w:rFonts w:ascii="BC Sans" w:eastAsia="BC Sans" w:hAnsi="BC Sans" w:cs="BC Sans"/>
-                <w:sz w:val="18"/>
-                <w:szCs w:val="18"/>
-              </w:rPr>
-              <w:t>_</w:t>
-            </w:r>
-            <w:proofErr w:type="gramStart"/>
+              <w:t>{d.</w:t>
+            </w:r>
+            <w:r>
+              <w:rPr>
+                <w:rFonts w:ascii="BC Sans" w:eastAsia="BC Sans" w:hAnsi="BC Sans" w:cs="BC Sans"/>
+                <w:sz w:val="18"/>
+                <w:szCs w:val="18"/>
+              </w:rPr>
+              <w:t>applicant_</w:t>
+            </w:r>
             <w:r>
               <w:rPr>
                 <w:rFonts w:ascii="BC Sans" w:eastAsia="BC Sans" w:hAnsi="BC Sans" w:cs="BC Sans"/>
@@ -318,8 +278,6 @@
               </w:rPr>
               <w:t>:convCRLF</w:t>
             </w:r>
-            <w:proofErr w:type="spellEnd"/>
-            <w:proofErr w:type="gramEnd"/>
             <w:r>
               <w:rPr>
                 <w:rFonts w:ascii="BC Sans" w:eastAsia="BC Sans" w:hAnsi="BC Sans" w:cs="BC Sans"/>
@@ -398,36 +356,16 @@
                 <w:sz w:val="18"/>
                 <w:szCs w:val="18"/>
               </w:rPr>
-              <w:t>{</w:t>
-            </w:r>
-            <w:proofErr w:type="spellStart"/>
-            <w:proofErr w:type="gramStart"/>
-            <w:r>
-              <w:rPr>
-                <w:rFonts w:ascii="BC Sans" w:eastAsia="BC Sans" w:hAnsi="BC Sans" w:cs="BC Sans"/>
-                <w:sz w:val="18"/>
-                <w:szCs w:val="18"/>
-              </w:rPr>
-              <w:t>d.</w:t>
-            </w:r>
-            <w:r>
-              <w:rPr>
-                <w:rFonts w:ascii="BC Sans" w:eastAsia="BC Sans" w:hAnsi="BC Sans" w:cs="BC Sans"/>
-                <w:sz w:val="18"/>
-                <w:szCs w:val="18"/>
-              </w:rPr>
-              <w:t>invoice</w:t>
-            </w:r>
-            <w:proofErr w:type="gramEnd"/>
-            <w:r>
-              <w:rPr>
-                <w:rFonts w:ascii="BC Sans" w:eastAsia="BC Sans" w:hAnsi="BC Sans" w:cs="BC Sans"/>
-                <w:sz w:val="18"/>
-                <w:szCs w:val="18"/>
-              </w:rPr>
-              <w:t>_date</w:t>
-            </w:r>
-            <w:proofErr w:type="spellEnd"/>
+              <w:t>{d.</w:t>
+            </w:r>
+            <w:r>
+              <w:rPr>
+                <w:rFonts w:ascii="BC Sans" w:eastAsia="BC Sans" w:hAnsi="BC Sans" w:cs="BC Sans"/>
+                <w:sz w:val="18"/>
+                <w:szCs w:val="18"/>
+              </w:rPr>
+              <w:t>invoice_date</w:t>
+            </w:r>
             <w:r>
               <w:rPr>
                 <w:rFonts w:ascii="BC Sans" w:eastAsia="BC Sans" w:hAnsi="BC Sans" w:cs="BC Sans"/>
@@ -550,27 +488,7 @@
                 <w:sz w:val="18"/>
                 <w:szCs w:val="18"/>
               </w:rPr>
-              <w:t>{</w:t>
-            </w:r>
-            <w:proofErr w:type="spellStart"/>
-            <w:proofErr w:type="gramStart"/>
-            <w:r>
-              <w:rPr>
-                <w:rFonts w:ascii="BC Sans" w:eastAsia="BC Sans" w:hAnsi="BC Sans" w:cs="BC Sans"/>
-                <w:sz w:val="18"/>
-                <w:szCs w:val="18"/>
-              </w:rPr>
-              <w:t>d.axisRequestId</w:t>
-            </w:r>
-            <w:proofErr w:type="spellEnd"/>
-            <w:proofErr w:type="gramEnd"/>
-            <w:r>
-              <w:rPr>
-                <w:rFonts w:ascii="BC Sans" w:eastAsia="BC Sans" w:hAnsi="BC Sans" w:cs="BC Sans"/>
-                <w:sz w:val="18"/>
-                <w:szCs w:val="18"/>
-              </w:rPr>
-              <w:t>}</w:t>
+              <w:t>{d.axisRequestId}</w:t>
             </w:r>
           </w:p>
         </w:tc>
@@ -904,19 +822,8 @@
                 <w:sz w:val="18"/>
                 <w:szCs w:val="18"/>
               </w:rPr>
-              <w:t xml:space="preserve">Locating &amp; </w:t>
-            </w:r>
-            <w:proofErr w:type="gramStart"/>
-            <w:r>
-              <w:rPr>
-                <w:rFonts w:ascii="BC Sans" w:eastAsia="BC Sans" w:hAnsi="BC Sans" w:cs="BC Sans"/>
-                <w:color w:val="000000"/>
-                <w:sz w:val="18"/>
-                <w:szCs w:val="18"/>
-              </w:rPr>
-              <w:t>Retrieving</w:t>
-            </w:r>
-            <w:proofErr w:type="gramEnd"/>
+              <w:t>Locating &amp; Retrieving</w:t>
+            </w:r>
           </w:p>
         </w:tc>
         <w:tc>
@@ -944,21 +851,84 @@
                 <w:sz w:val="18"/>
                 <w:szCs w:val="18"/>
               </w:rPr>
+              <w:t>{d.locatinghrs}</w:t>
+            </w:r>
+          </w:p>
+        </w:tc>
+        <w:tc>
+          <w:tcPr>
+            <w:tcW w:w="855" w:type="dxa"/>
+            <w:vAlign w:val="center"/>
+          </w:tcPr>
+          <w:p>
+            <w:pPr>
+              <w:tabs>
+                <w:tab w:val="left" w:pos="5575"/>
+              </w:tabs>
+              <w:jc w:val="center"/>
+              <w:rPr>
+                <w:rFonts w:ascii="BC Sans" w:eastAsia="BC Sans" w:hAnsi="BC Sans" w:cs="BC Sans"/>
+                <w:color w:val="000000"/>
+                <w:sz w:val="18"/>
+                <w:szCs w:val="18"/>
+              </w:rPr>
+            </w:pPr>
+            <w:r>
+              <w:rPr>
+                <w:rFonts w:ascii="BC Sans" w:eastAsia="BC Sans" w:hAnsi="BC Sans" w:cs="BC Sans"/>
+                <w:color w:val="000000"/>
+                <w:sz w:val="18"/>
+                <w:szCs w:val="18"/>
+              </w:rPr>
+              <w:t>$30.00</w:t>
+            </w:r>
+          </w:p>
+        </w:tc>
+        <w:tc>
+          <w:tcPr>
+            <w:tcW w:w="992" w:type="dxa"/>
+            <w:vAlign w:val="center"/>
+          </w:tcPr>
+          <w:p>
+            <w:pPr>
+              <w:tabs>
+                <w:tab w:val="left" w:pos="5575"/>
+              </w:tabs>
+              <w:jc w:val="center"/>
+              <w:rPr>
+                <w:rFonts w:ascii="BC Sans" w:eastAsia="BC Sans" w:hAnsi="BC Sans" w:cs="BC Sans"/>
+                <w:color w:val="000000"/>
+                <w:sz w:val="18"/>
+                <w:szCs w:val="18"/>
+              </w:rPr>
+            </w:pPr>
+            <w:r>
+              <w:rPr>
+                <w:rFonts w:ascii="BC Sans" w:eastAsia="BC Sans" w:hAnsi="BC Sans" w:cs="BC Sans"/>
+                <w:color w:val="000000"/>
+                <w:sz w:val="18"/>
+                <w:szCs w:val="18"/>
+              </w:rPr>
+              <w:t>$</w:t>
+            </w:r>
+            <w:r>
+              <w:rPr>
+                <w:rFonts w:ascii="BC Sans" w:eastAsia="BC Sans" w:hAnsi="BC Sans" w:cs="BC Sans"/>
+                <w:color w:val="000000"/>
+                <w:sz w:val="18"/>
+                <w:szCs w:val="18"/>
+              </w:rPr>
               <w:t>{</w:t>
             </w:r>
-            <w:proofErr w:type="spellStart"/>
-            <w:proofErr w:type="gramStart"/>
-            <w:r>
-              <w:rPr>
-                <w:rFonts w:ascii="BC Sans" w:eastAsia="BC Sans" w:hAnsi="BC Sans" w:cs="BC Sans"/>
-                <w:color w:val="000000"/>
-                <w:sz w:val="18"/>
-                <w:szCs w:val="18"/>
-              </w:rPr>
-              <w:t>d.locatinghrs</w:t>
-            </w:r>
-            <w:proofErr w:type="spellEnd"/>
-            <w:proofErr w:type="gramEnd"/>
+            <w:r>
+              <w:rPr>
+                <w:rFonts w:ascii="BC Sans" w:eastAsia="BC Sans" w:hAnsi="BC Sans" w:cs="BC Sans"/>
+                <w:color w:val="000000"/>
+                <w:sz w:val="18"/>
+                <w:szCs w:val="18"/>
+              </w:rPr>
+              <w:t xml:space="preserve"> d.locatinghrs:mul(30):formatN(2)</w:t>
+            </w:r>
             <w:r>
               <w:rPr>
                 <w:rFonts w:ascii="BC Sans" w:eastAsia="BC Sans" w:hAnsi="BC Sans" w:cs="BC Sans"/>
@@ -972,7 +942,7 @@
         </w:tc>
         <w:tc>
           <w:tcPr>
-            <w:tcW w:w="855" w:type="dxa"/>
+            <w:tcW w:w="1985" w:type="dxa"/>
             <w:vAlign w:val="center"/>
           </w:tcPr>
           <w:p>
@@ -995,13 +965,13 @@
                 <w:sz w:val="18"/>
                 <w:szCs w:val="18"/>
               </w:rPr>
-              <w:t>$30.00</w:t>
-            </w:r>
-          </w:p>
-        </w:tc>
-        <w:tc>
-          <w:tcPr>
-            <w:tcW w:w="992" w:type="dxa"/>
+              <w:t>${ d.waivedAmount:formatN(2)}</w:t>
+            </w:r>
+          </w:p>
+        </w:tc>
+        <w:tc>
+          <w:tcPr>
+            <w:tcW w:w="1399" w:type="dxa"/>
             <w:vAlign w:val="center"/>
           </w:tcPr>
           <w:p>
@@ -1017,45 +987,33 @@
                 <w:szCs w:val="18"/>
               </w:rPr>
             </w:pPr>
-            <w:proofErr w:type="gramStart"/>
-            <w:r>
-              <w:rPr>
-                <w:rFonts w:ascii="BC Sans" w:eastAsia="BC Sans" w:hAnsi="BC Sans" w:cs="BC Sans"/>
-                <w:color w:val="000000"/>
-                <w:sz w:val="18"/>
-                <w:szCs w:val="18"/>
-              </w:rPr>
-              <w:t>$</w:t>
-            </w:r>
-            <w:r>
-              <w:rPr>
-                <w:rFonts w:ascii="BC Sans" w:eastAsia="BC Sans" w:hAnsi="BC Sans" w:cs="BC Sans"/>
-                <w:color w:val="000000"/>
-                <w:sz w:val="18"/>
-                <w:szCs w:val="18"/>
-              </w:rPr>
-              <w:t>{</w:t>
-            </w:r>
-            <w:r>
-              <w:rPr>
-                <w:rFonts w:ascii="BC Sans" w:eastAsia="BC Sans" w:hAnsi="BC Sans" w:cs="BC Sans"/>
-                <w:color w:val="000000"/>
-                <w:sz w:val="18"/>
-                <w:szCs w:val="18"/>
-              </w:rPr>
-              <w:t xml:space="preserve"> </w:t>
-            </w:r>
-            <w:proofErr w:type="spellStart"/>
-            <w:r>
-              <w:rPr>
-                <w:rFonts w:ascii="BC Sans" w:eastAsia="BC Sans" w:hAnsi="BC Sans" w:cs="BC Sans"/>
-                <w:color w:val="000000"/>
-                <w:sz w:val="18"/>
-                <w:szCs w:val="18"/>
-              </w:rPr>
-              <w:t>d</w:t>
-            </w:r>
-            <w:proofErr w:type="gramEnd"/>
+            <w:r>
+              <w:rPr>
+                <w:rFonts w:ascii="BC Sans" w:eastAsia="BC Sans" w:hAnsi="BC Sans" w:cs="BC Sans"/>
+                <w:color w:val="000000"/>
+                <w:sz w:val="18"/>
+                <w:szCs w:val="18"/>
+              </w:rPr>
+              <w:t>${</w:t>
+            </w:r>
+            <w:r>
+              <w:rPr>
+                <w:rFonts w:ascii="BC Sans" w:eastAsia="BC Sans" w:hAnsi="BC Sans" w:cs="BC Sans"/>
+                <w:color w:val="000000"/>
+                <w:sz w:val="18"/>
+                <w:szCs w:val="18"/>
+              </w:rPr>
+              <w:t xml:space="preserve"> d.locatinghrs:mul(30)</w:t>
+            </w:r>
+            <w:r>
+              <w:rPr>
+                <w:rFonts w:ascii="BC Sans" w:eastAsia="BC Sans" w:hAnsi="BC Sans" w:cs="BC Sans"/>
+                <w:color w:val="000000"/>
+                <w:sz w:val="18"/>
+                <w:szCs w:val="18"/>
+              </w:rPr>
+              <w:t>:sub(</w:t>
+            </w:r>
             <w:r>
               <w:rPr>
                 <w:rFonts w:ascii="BC Sans" w:eastAsia="BC Sans" w:hAnsi="BC Sans" w:cs="BC Sans"/>
@@ -1065,219 +1023,15 @@
               </w:rPr>
               <w:t>.</w:t>
             </w:r>
-            <w:proofErr w:type="gramStart"/>
-            <w:r>
-              <w:rPr>
-                <w:rFonts w:ascii="BC Sans" w:eastAsia="BC Sans" w:hAnsi="BC Sans" w:cs="BC Sans"/>
-                <w:color w:val="000000"/>
-                <w:sz w:val="18"/>
-                <w:szCs w:val="18"/>
-              </w:rPr>
-              <w:t>locatinghrs:mul</w:t>
-            </w:r>
-            <w:proofErr w:type="spellEnd"/>
-            <w:proofErr w:type="gramEnd"/>
-            <w:r>
-              <w:rPr>
-                <w:rFonts w:ascii="BC Sans" w:eastAsia="BC Sans" w:hAnsi="BC Sans" w:cs="BC Sans"/>
-                <w:color w:val="000000"/>
-                <w:sz w:val="18"/>
-                <w:szCs w:val="18"/>
-              </w:rPr>
-              <w:t>(30</w:t>
-            </w:r>
-            <w:proofErr w:type="gramStart"/>
-            <w:r>
-              <w:rPr>
-                <w:rFonts w:ascii="BC Sans" w:eastAsia="BC Sans" w:hAnsi="BC Sans" w:cs="BC Sans"/>
-                <w:color w:val="000000"/>
-                <w:sz w:val="18"/>
-                <w:szCs w:val="18"/>
-              </w:rPr>
-              <w:t>):</w:t>
-            </w:r>
-            <w:proofErr w:type="spellStart"/>
-            <w:r>
-              <w:rPr>
-                <w:rFonts w:ascii="BC Sans" w:eastAsia="BC Sans" w:hAnsi="BC Sans" w:cs="BC Sans"/>
-                <w:color w:val="000000"/>
-                <w:sz w:val="18"/>
-                <w:szCs w:val="18"/>
-              </w:rPr>
-              <w:t>formatN</w:t>
-            </w:r>
-            <w:proofErr w:type="spellEnd"/>
-            <w:proofErr w:type="gramEnd"/>
-            <w:r>
-              <w:rPr>
-                <w:rFonts w:ascii="BC Sans" w:eastAsia="BC Sans" w:hAnsi="BC Sans" w:cs="BC Sans"/>
-                <w:color w:val="000000"/>
-                <w:sz w:val="18"/>
-                <w:szCs w:val="18"/>
-              </w:rPr>
-              <w:t>(2)</w:t>
-            </w:r>
-            <w:r>
-              <w:rPr>
-                <w:rFonts w:ascii="BC Sans" w:eastAsia="BC Sans" w:hAnsi="BC Sans" w:cs="BC Sans"/>
-                <w:color w:val="000000"/>
-                <w:sz w:val="18"/>
-                <w:szCs w:val="18"/>
-              </w:rPr>
-              <w:t>}</w:t>
-            </w:r>
-          </w:p>
-        </w:tc>
-        <w:tc>
-          <w:tcPr>
-            <w:tcW w:w="1985" w:type="dxa"/>
-            <w:vAlign w:val="center"/>
-          </w:tcPr>
-          <w:p>
-            <w:pPr>
-              <w:tabs>
-                <w:tab w:val="left" w:pos="5575"/>
-              </w:tabs>
-              <w:jc w:val="center"/>
-              <w:rPr>
-                <w:rFonts w:ascii="BC Sans" w:eastAsia="BC Sans" w:hAnsi="BC Sans" w:cs="BC Sans"/>
-                <w:color w:val="000000"/>
-                <w:sz w:val="18"/>
-                <w:szCs w:val="18"/>
-              </w:rPr>
-            </w:pPr>
-            <w:proofErr w:type="gramStart"/>
-            <w:r>
-              <w:rPr>
-                <w:rFonts w:ascii="BC Sans" w:eastAsia="BC Sans" w:hAnsi="BC Sans" w:cs="BC Sans"/>
-                <w:color w:val="000000"/>
-                <w:sz w:val="18"/>
-                <w:szCs w:val="18"/>
-              </w:rPr>
-              <w:t xml:space="preserve">${ </w:t>
-            </w:r>
-            <w:proofErr w:type="spellStart"/>
-            <w:r>
-              <w:rPr>
-                <w:rFonts w:ascii="BC Sans" w:eastAsia="BC Sans" w:hAnsi="BC Sans" w:cs="BC Sans"/>
-                <w:color w:val="000000"/>
-                <w:sz w:val="18"/>
-                <w:szCs w:val="18"/>
-              </w:rPr>
-              <w:t>d</w:t>
-            </w:r>
-            <w:proofErr w:type="gramEnd"/>
-            <w:r>
-              <w:rPr>
-                <w:rFonts w:ascii="BC Sans" w:eastAsia="BC Sans" w:hAnsi="BC Sans" w:cs="BC Sans"/>
-                <w:color w:val="000000"/>
-                <w:sz w:val="18"/>
-                <w:szCs w:val="18"/>
-              </w:rPr>
-              <w:t>.</w:t>
-            </w:r>
-            <w:proofErr w:type="gramStart"/>
-            <w:r>
-              <w:rPr>
-                <w:rFonts w:ascii="BC Sans" w:eastAsia="BC Sans" w:hAnsi="BC Sans" w:cs="BC Sans"/>
-                <w:color w:val="000000"/>
-                <w:sz w:val="18"/>
-                <w:szCs w:val="18"/>
-              </w:rPr>
-              <w:t>waivedAmount:formatN</w:t>
-            </w:r>
-            <w:proofErr w:type="spellEnd"/>
-            <w:proofErr w:type="gramEnd"/>
-            <w:r>
-              <w:rPr>
-                <w:rFonts w:ascii="BC Sans" w:eastAsia="BC Sans" w:hAnsi="BC Sans" w:cs="BC Sans"/>
-                <w:color w:val="000000"/>
-                <w:sz w:val="18"/>
-                <w:szCs w:val="18"/>
-              </w:rPr>
-              <w:t>(2)}</w:t>
-            </w:r>
-          </w:p>
-        </w:tc>
-        <w:tc>
-          <w:tcPr>
-            <w:tcW w:w="1399" w:type="dxa"/>
-            <w:vAlign w:val="center"/>
-          </w:tcPr>
-          <w:p>
-            <w:pPr>
-              <w:tabs>
-                <w:tab w:val="left" w:pos="5575"/>
-              </w:tabs>
-              <w:jc w:val="center"/>
-              <w:rPr>
-                <w:rFonts w:ascii="BC Sans" w:eastAsia="BC Sans" w:hAnsi="BC Sans" w:cs="BC Sans"/>
-                <w:color w:val="000000"/>
-                <w:sz w:val="18"/>
-                <w:szCs w:val="18"/>
-              </w:rPr>
-            </w:pPr>
-            <w:proofErr w:type="gramStart"/>
-            <w:r>
-              <w:rPr>
-                <w:rFonts w:ascii="BC Sans" w:eastAsia="BC Sans" w:hAnsi="BC Sans" w:cs="BC Sans"/>
-                <w:color w:val="000000"/>
-                <w:sz w:val="18"/>
-                <w:szCs w:val="18"/>
-              </w:rPr>
-              <w:t>${</w:t>
-            </w:r>
-            <w:r>
-              <w:rPr>
-                <w:rFonts w:ascii="BC Sans" w:eastAsia="BC Sans" w:hAnsi="BC Sans" w:cs="BC Sans"/>
-                <w:color w:val="000000"/>
-                <w:sz w:val="18"/>
-                <w:szCs w:val="18"/>
-              </w:rPr>
-              <w:t xml:space="preserve"> </w:t>
-            </w:r>
-            <w:proofErr w:type="spellStart"/>
-            <w:r>
-              <w:rPr>
-                <w:rFonts w:ascii="BC Sans" w:eastAsia="BC Sans" w:hAnsi="BC Sans" w:cs="BC Sans"/>
-                <w:color w:val="000000"/>
-                <w:sz w:val="18"/>
-                <w:szCs w:val="18"/>
-              </w:rPr>
-              <w:t>d</w:t>
-            </w:r>
-            <w:proofErr w:type="gramEnd"/>
-            <w:r>
-              <w:rPr>
-                <w:rFonts w:ascii="BC Sans" w:eastAsia="BC Sans" w:hAnsi="BC Sans" w:cs="BC Sans"/>
-                <w:color w:val="000000"/>
-                <w:sz w:val="18"/>
-                <w:szCs w:val="18"/>
-              </w:rPr>
-              <w:t>.</w:t>
-            </w:r>
-            <w:proofErr w:type="gramStart"/>
-            <w:r>
-              <w:rPr>
-                <w:rFonts w:ascii="BC Sans" w:eastAsia="BC Sans" w:hAnsi="BC Sans" w:cs="BC Sans"/>
-                <w:color w:val="000000"/>
-                <w:sz w:val="18"/>
-                <w:szCs w:val="18"/>
-              </w:rPr>
-              <w:t>locatinghrs:mul</w:t>
-            </w:r>
-            <w:proofErr w:type="spellEnd"/>
-            <w:proofErr w:type="gramEnd"/>
-            <w:r>
-              <w:rPr>
-                <w:rFonts w:ascii="BC Sans" w:eastAsia="BC Sans" w:hAnsi="BC Sans" w:cs="BC Sans"/>
-                <w:color w:val="000000"/>
-                <w:sz w:val="18"/>
-                <w:szCs w:val="18"/>
-              </w:rPr>
-              <w:t>(30</w:t>
-            </w:r>
-            <w:proofErr w:type="gramStart"/>
+            <w:r>
+              <w:rPr>
+                <w:rFonts w:ascii="BC Sans" w:eastAsia="BC Sans" w:hAnsi="BC Sans" w:cs="BC Sans"/>
+                <w:color w:val="000000"/>
+                <w:sz w:val="18"/>
+                <w:szCs w:val="18"/>
+              </w:rPr>
+              <w:t>waivedAmount</w:t>
+            </w:r>
             <w:r>
               <w:rPr>
                 <w:rFonts w:ascii="BC Sans" w:eastAsia="BC Sans" w:hAnsi="BC Sans" w:cs="BC Sans"/>
@@ -1294,66 +1048,7 @@
                 <w:sz w:val="18"/>
                 <w:szCs w:val="18"/>
               </w:rPr>
-              <w:t>:sub(</w:t>
-            </w:r>
-            <w:r>
-              <w:rPr>
-                <w:rFonts w:ascii="BC Sans" w:eastAsia="BC Sans" w:hAnsi="BC Sans" w:cs="BC Sans"/>
-                <w:color w:val="000000"/>
-                <w:sz w:val="18"/>
-                <w:szCs w:val="18"/>
-              </w:rPr>
-              <w:t>.</w:t>
-            </w:r>
-            <w:proofErr w:type="spellStart"/>
-            <w:r>
-              <w:rPr>
-                <w:rFonts w:ascii="BC Sans" w:eastAsia="BC Sans" w:hAnsi="BC Sans" w:cs="BC Sans"/>
-                <w:color w:val="000000"/>
-                <w:sz w:val="18"/>
-                <w:szCs w:val="18"/>
-              </w:rPr>
-              <w:t>waivedAmount</w:t>
-            </w:r>
-            <w:proofErr w:type="spellEnd"/>
-            <w:r>
-              <w:rPr>
-                <w:rFonts w:ascii="BC Sans" w:eastAsia="BC Sans" w:hAnsi="BC Sans" w:cs="BC Sans"/>
-                <w:color w:val="000000"/>
-                <w:sz w:val="18"/>
-                <w:szCs w:val="18"/>
-              </w:rPr>
-              <w:t>)</w:t>
-            </w:r>
-            <w:r>
-              <w:rPr>
-                <w:rFonts w:ascii="BC Sans" w:eastAsia="BC Sans" w:hAnsi="BC Sans" w:cs="BC Sans"/>
-                <w:color w:val="000000"/>
-                <w:sz w:val="18"/>
-                <w:szCs w:val="18"/>
-              </w:rPr>
-              <w:t>:</w:t>
-            </w:r>
-            <w:proofErr w:type="spellStart"/>
-            <w:r>
-              <w:rPr>
-                <w:rFonts w:ascii="BC Sans" w:eastAsia="BC Sans" w:hAnsi="BC Sans" w:cs="BC Sans"/>
-                <w:color w:val="000000"/>
-                <w:sz w:val="18"/>
-                <w:szCs w:val="18"/>
-              </w:rPr>
-              <w:t>formatN</w:t>
-            </w:r>
-            <w:proofErr w:type="spellEnd"/>
-            <w:proofErr w:type="gramEnd"/>
-            <w:r>
-              <w:rPr>
-                <w:rFonts w:ascii="BC Sans" w:eastAsia="BC Sans" w:hAnsi="BC Sans" w:cs="BC Sans"/>
-                <w:color w:val="000000"/>
-                <w:sz w:val="18"/>
-                <w:szCs w:val="18"/>
-              </w:rPr>
-              <w:t>(2)</w:t>
+              <w:t>:formatN(2)</w:t>
             </w:r>
             <w:r>
               <w:rPr>
@@ -1426,29 +1121,7 @@
                 <w:sz w:val="18"/>
                 <w:szCs w:val="18"/>
               </w:rPr>
-              <w:t>{</w:t>
-            </w:r>
-            <w:proofErr w:type="spellStart"/>
-            <w:proofErr w:type="gramStart"/>
-            <w:r>
-              <w:rPr>
-                <w:rFonts w:ascii="BC Sans" w:eastAsia="BC Sans" w:hAnsi="BC Sans" w:cs="BC Sans"/>
-                <w:color w:val="000000"/>
-                <w:sz w:val="18"/>
-                <w:szCs w:val="18"/>
-              </w:rPr>
-              <w:t>d.producinghrs</w:t>
-            </w:r>
-            <w:proofErr w:type="spellEnd"/>
-            <w:proofErr w:type="gramEnd"/>
-            <w:r>
-              <w:rPr>
-                <w:rFonts w:ascii="BC Sans" w:eastAsia="BC Sans" w:hAnsi="BC Sans" w:cs="BC Sans"/>
-                <w:color w:val="000000"/>
-                <w:sz w:val="18"/>
-                <w:szCs w:val="18"/>
-              </w:rPr>
-              <w:t>}</w:t>
+              <w:t>{d.producinghrs}</w:t>
             </w:r>
           </w:p>
         </w:tc>
@@ -1506,69 +1179,7 @@
                 <w:sz w:val="18"/>
                 <w:szCs w:val="18"/>
               </w:rPr>
-              <w:t>${</w:t>
-            </w:r>
-            <w:proofErr w:type="spellStart"/>
-            <w:proofErr w:type="gramStart"/>
-            <w:r>
-              <w:rPr>
-                <w:rFonts w:ascii="BC Sans" w:eastAsia="BC Sans" w:hAnsi="BC Sans" w:cs="BC Sans"/>
-                <w:color w:val="000000"/>
-                <w:sz w:val="18"/>
-                <w:szCs w:val="18"/>
-              </w:rPr>
-              <w:t>d.producinghrs</w:t>
-            </w:r>
-            <w:proofErr w:type="gramEnd"/>
-            <w:r>
-              <w:rPr>
-                <w:rFonts w:ascii="BC Sans" w:eastAsia="BC Sans" w:hAnsi="BC Sans" w:cs="BC Sans"/>
-                <w:color w:val="000000"/>
-                <w:sz w:val="18"/>
-                <w:szCs w:val="18"/>
-              </w:rPr>
-              <w:t>:mul</w:t>
-            </w:r>
-            <w:proofErr w:type="spellEnd"/>
-            <w:r>
-              <w:rPr>
-                <w:rFonts w:ascii="BC Sans" w:eastAsia="BC Sans" w:hAnsi="BC Sans" w:cs="BC Sans"/>
-                <w:color w:val="000000"/>
-                <w:sz w:val="18"/>
-                <w:szCs w:val="18"/>
-              </w:rPr>
-              <w:t>(30</w:t>
-            </w:r>
-            <w:proofErr w:type="gramStart"/>
-            <w:r>
-              <w:rPr>
-                <w:rFonts w:ascii="BC Sans" w:eastAsia="BC Sans" w:hAnsi="BC Sans" w:cs="BC Sans"/>
-                <w:color w:val="000000"/>
-                <w:sz w:val="18"/>
-                <w:szCs w:val="18"/>
-              </w:rPr>
-              <w:t>):</w:t>
-            </w:r>
-            <w:proofErr w:type="spellStart"/>
-            <w:r>
-              <w:rPr>
-                <w:rFonts w:ascii="BC Sans" w:eastAsia="BC Sans" w:hAnsi="BC Sans" w:cs="BC Sans"/>
-                <w:color w:val="000000"/>
-                <w:sz w:val="18"/>
-                <w:szCs w:val="18"/>
-              </w:rPr>
-              <w:t>formatN</w:t>
-            </w:r>
-            <w:proofErr w:type="spellEnd"/>
-            <w:proofErr w:type="gramEnd"/>
-            <w:r>
-              <w:rPr>
-                <w:rFonts w:ascii="BC Sans" w:eastAsia="BC Sans" w:hAnsi="BC Sans" w:cs="BC Sans"/>
-                <w:color w:val="000000"/>
-                <w:sz w:val="18"/>
-                <w:szCs w:val="18"/>
-              </w:rPr>
-              <w:t>(2)}</w:t>
+              <w:t>${d.producinghrs:mul(30):formatN(2)}</w:t>
             </w:r>
           </w:p>
         </w:tc>
@@ -1626,69 +1237,7 @@
                 <w:sz w:val="18"/>
                 <w:szCs w:val="18"/>
               </w:rPr>
-              <w:t>${</w:t>
-            </w:r>
-            <w:proofErr w:type="spellStart"/>
-            <w:proofErr w:type="gramStart"/>
-            <w:r>
-              <w:rPr>
-                <w:rFonts w:ascii="BC Sans" w:eastAsia="BC Sans" w:hAnsi="BC Sans" w:cs="BC Sans"/>
-                <w:color w:val="000000"/>
-                <w:sz w:val="18"/>
-                <w:szCs w:val="18"/>
-              </w:rPr>
-              <w:t>d.producinghrs</w:t>
-            </w:r>
-            <w:proofErr w:type="gramEnd"/>
-            <w:r>
-              <w:rPr>
-                <w:rFonts w:ascii="BC Sans" w:eastAsia="BC Sans" w:hAnsi="BC Sans" w:cs="BC Sans"/>
-                <w:color w:val="000000"/>
-                <w:sz w:val="18"/>
-                <w:szCs w:val="18"/>
-              </w:rPr>
-              <w:t>:mul</w:t>
-            </w:r>
-            <w:proofErr w:type="spellEnd"/>
-            <w:r>
-              <w:rPr>
-                <w:rFonts w:ascii="BC Sans" w:eastAsia="BC Sans" w:hAnsi="BC Sans" w:cs="BC Sans"/>
-                <w:color w:val="000000"/>
-                <w:sz w:val="18"/>
-                <w:szCs w:val="18"/>
-              </w:rPr>
-              <w:t>(30</w:t>
-            </w:r>
-            <w:proofErr w:type="gramStart"/>
-            <w:r>
-              <w:rPr>
-                <w:rFonts w:ascii="BC Sans" w:eastAsia="BC Sans" w:hAnsi="BC Sans" w:cs="BC Sans"/>
-                <w:color w:val="000000"/>
-                <w:sz w:val="18"/>
-                <w:szCs w:val="18"/>
-              </w:rPr>
-              <w:t>):</w:t>
-            </w:r>
-            <w:proofErr w:type="spellStart"/>
-            <w:r>
-              <w:rPr>
-                <w:rFonts w:ascii="BC Sans" w:eastAsia="BC Sans" w:hAnsi="BC Sans" w:cs="BC Sans"/>
-                <w:color w:val="000000"/>
-                <w:sz w:val="18"/>
-                <w:szCs w:val="18"/>
-              </w:rPr>
-              <w:t>formatN</w:t>
-            </w:r>
-            <w:proofErr w:type="spellEnd"/>
-            <w:proofErr w:type="gramEnd"/>
-            <w:r>
-              <w:rPr>
-                <w:rFonts w:ascii="BC Sans" w:eastAsia="BC Sans" w:hAnsi="BC Sans" w:cs="BC Sans"/>
-                <w:color w:val="000000"/>
-                <w:sz w:val="18"/>
-                <w:szCs w:val="18"/>
-              </w:rPr>
-              <w:t>(2)}</w:t>
+              <w:t>${d.producinghrs:mul(30):formatN(2)}</w:t>
             </w:r>
           </w:p>
         </w:tc>
@@ -1752,61 +1301,8 @@
                 <w:sz w:val="18"/>
                 <w:szCs w:val="18"/>
               </w:rPr>
-              <w:t>{</w:t>
-            </w:r>
-            <w:proofErr w:type="spellStart"/>
-            <w:proofErr w:type="gramStart"/>
-            <w:r>
-              <w:rPr>
-                <w:rFonts w:ascii="BC Sans" w:eastAsia="BC Sans" w:hAnsi="BC Sans" w:cs="BC Sans"/>
-                <w:color w:val="000000"/>
-                <w:sz w:val="18"/>
-                <w:szCs w:val="18"/>
-              </w:rPr>
-              <w:t>d.iaopreparinghrs</w:t>
-            </w:r>
-            <w:proofErr w:type="gramEnd"/>
-            <w:r>
-              <w:rPr>
-                <w:rFonts w:ascii="BC Sans" w:eastAsia="BC Sans" w:hAnsi="BC Sans" w:cs="BC Sans"/>
-                <w:color w:val="000000"/>
-                <w:sz w:val="18"/>
-                <w:szCs w:val="18"/>
-              </w:rPr>
-              <w:t>:add</w:t>
-            </w:r>
-            <w:proofErr w:type="spellEnd"/>
-            <w:proofErr w:type="gramStart"/>
-            <w:r>
-              <w:rPr>
-                <w:rFonts w:ascii="BC Sans" w:eastAsia="BC Sans" w:hAnsi="BC Sans" w:cs="BC Sans"/>
-                <w:color w:val="000000"/>
-                <w:sz w:val="18"/>
-                <w:szCs w:val="18"/>
-              </w:rPr>
-              <w:t>(.</w:t>
-            </w:r>
-            <w:proofErr w:type="spellStart"/>
-            <w:r>
-              <w:rPr>
-                <w:rFonts w:ascii="BC Sans" w:eastAsia="BC Sans" w:hAnsi="BC Sans" w:cs="BC Sans"/>
-                <w:color w:val="000000"/>
-                <w:sz w:val="18"/>
-                <w:szCs w:val="18"/>
-              </w:rPr>
-              <w:t>ministrypreparinghrs</w:t>
-            </w:r>
-            <w:proofErr w:type="spellEnd"/>
-            <w:r>
-              <w:rPr>
-                <w:rFonts w:ascii="BC Sans" w:eastAsia="BC Sans" w:hAnsi="BC Sans" w:cs="BC Sans"/>
-                <w:color w:val="000000"/>
-                <w:sz w:val="18"/>
-                <w:szCs w:val="18"/>
-              </w:rPr>
-              <w:t>) }</w:t>
-            </w:r>
-            <w:proofErr w:type="gramEnd"/>
+              <w:t>{d.iaopreparinghrs:add(.ministrypreparinghrs) }</w:t>
+            </w:r>
           </w:p>
         </w:tc>
         <w:tc>
@@ -1856,127 +1352,14 @@
                 <w:szCs w:val="18"/>
               </w:rPr>
             </w:pPr>
-            <w:proofErr w:type="gramStart"/>
-            <w:r>
-              <w:rPr>
-                <w:rFonts w:ascii="BC Sans" w:eastAsia="BC Sans" w:hAnsi="BC Sans" w:cs="BC Sans"/>
-                <w:color w:val="000000"/>
-                <w:sz w:val="18"/>
-                <w:szCs w:val="18"/>
-              </w:rPr>
-              <w:t xml:space="preserve">${ </w:t>
-            </w:r>
-            <w:proofErr w:type="spellStart"/>
-            <w:r>
-              <w:rPr>
-                <w:rFonts w:ascii="BC Sans" w:eastAsia="BC Sans" w:hAnsi="BC Sans" w:cs="BC Sans"/>
-                <w:color w:val="000000"/>
-                <w:sz w:val="18"/>
-                <w:szCs w:val="18"/>
-              </w:rPr>
-              <w:t>d</w:t>
-            </w:r>
-            <w:proofErr w:type="gramEnd"/>
-            <w:r>
-              <w:rPr>
-                <w:rFonts w:ascii="BC Sans" w:eastAsia="BC Sans" w:hAnsi="BC Sans" w:cs="BC Sans"/>
-                <w:color w:val="000000"/>
-                <w:sz w:val="18"/>
-                <w:szCs w:val="18"/>
-              </w:rPr>
-              <w:t>.</w:t>
-            </w:r>
-            <w:proofErr w:type="gramStart"/>
-            <w:r>
-              <w:rPr>
-                <w:rFonts w:ascii="BC Sans" w:eastAsia="BC Sans" w:hAnsi="BC Sans" w:cs="BC Sans"/>
-                <w:color w:val="000000"/>
-                <w:sz w:val="18"/>
-                <w:szCs w:val="18"/>
-              </w:rPr>
-              <w:t>iaopreparinghrs:add</w:t>
-            </w:r>
-            <w:proofErr w:type="spellEnd"/>
-            <w:r>
-              <w:rPr>
-                <w:rFonts w:ascii="BC Sans" w:eastAsia="BC Sans" w:hAnsi="BC Sans" w:cs="BC Sans"/>
-                <w:color w:val="000000"/>
-                <w:sz w:val="18"/>
-                <w:szCs w:val="18"/>
-              </w:rPr>
-              <w:t>(.</w:t>
-            </w:r>
-            <w:proofErr w:type="spellStart"/>
-            <w:r>
-              <w:rPr>
-                <w:rFonts w:ascii="BC Sans" w:eastAsia="BC Sans" w:hAnsi="BC Sans" w:cs="BC Sans"/>
-                <w:color w:val="000000"/>
-                <w:sz w:val="18"/>
-                <w:szCs w:val="18"/>
-              </w:rPr>
-              <w:t>ministrypreparinghrs</w:t>
-            </w:r>
-            <w:proofErr w:type="spellEnd"/>
-            <w:r>
-              <w:rPr>
-                <w:rFonts w:ascii="BC Sans" w:eastAsia="BC Sans" w:hAnsi="BC Sans" w:cs="BC Sans"/>
-                <w:color w:val="000000"/>
-                <w:sz w:val="18"/>
-                <w:szCs w:val="18"/>
-              </w:rPr>
-              <w:t>):</w:t>
-            </w:r>
-            <w:proofErr w:type="spellStart"/>
-            <w:r>
-              <w:rPr>
-                <w:rFonts w:ascii="BC Sans" w:eastAsia="BC Sans" w:hAnsi="BC Sans" w:cs="BC Sans"/>
-                <w:color w:val="000000"/>
-                <w:sz w:val="18"/>
-                <w:szCs w:val="18"/>
-              </w:rPr>
-              <w:t>mul</w:t>
-            </w:r>
-            <w:proofErr w:type="spellEnd"/>
-            <w:proofErr w:type="gramEnd"/>
-            <w:r>
-              <w:rPr>
-                <w:rFonts w:ascii="BC Sans" w:eastAsia="BC Sans" w:hAnsi="BC Sans" w:cs="BC Sans"/>
-                <w:color w:val="000000"/>
-                <w:sz w:val="18"/>
-                <w:szCs w:val="18"/>
-              </w:rPr>
-              <w:t>(30</w:t>
-            </w:r>
-            <w:proofErr w:type="gramStart"/>
-            <w:r>
-              <w:rPr>
-                <w:rFonts w:ascii="BC Sans" w:eastAsia="BC Sans" w:hAnsi="BC Sans" w:cs="BC Sans"/>
-                <w:color w:val="000000"/>
-                <w:sz w:val="18"/>
-                <w:szCs w:val="18"/>
-              </w:rPr>
-              <w:t>):</w:t>
-            </w:r>
-            <w:proofErr w:type="spellStart"/>
-            <w:r>
-              <w:rPr>
-                <w:rFonts w:ascii="BC Sans" w:eastAsia="BC Sans" w:hAnsi="BC Sans" w:cs="BC Sans"/>
-                <w:color w:val="000000"/>
-                <w:sz w:val="18"/>
-                <w:szCs w:val="18"/>
-              </w:rPr>
-              <w:t>formatN</w:t>
-            </w:r>
-            <w:proofErr w:type="spellEnd"/>
-            <w:proofErr w:type="gramEnd"/>
-            <w:r>
-              <w:rPr>
-                <w:rFonts w:ascii="BC Sans" w:eastAsia="BC Sans" w:hAnsi="BC Sans" w:cs="BC Sans"/>
-                <w:color w:val="000000"/>
-                <w:sz w:val="18"/>
-                <w:szCs w:val="18"/>
-              </w:rPr>
-              <w:t>(2)}</w:t>
+            <w:r>
+              <w:rPr>
+                <w:rFonts w:ascii="BC Sans" w:eastAsia="BC Sans" w:hAnsi="BC Sans" w:cs="BC Sans"/>
+                <w:color w:val="000000"/>
+                <w:sz w:val="18"/>
+                <w:szCs w:val="18"/>
+              </w:rPr>
+              <w:t>${ d.iaopreparinghrs:add(.ministrypreparinghrs):mul(30):formatN(2)}</w:t>
             </w:r>
           </w:p>
         </w:tc>
@@ -2027,127 +1410,14 @@
                 <w:szCs w:val="18"/>
               </w:rPr>
             </w:pPr>
-            <w:proofErr w:type="gramStart"/>
-            <w:r>
-              <w:rPr>
-                <w:rFonts w:ascii="BC Sans" w:eastAsia="BC Sans" w:hAnsi="BC Sans" w:cs="BC Sans"/>
-                <w:color w:val="000000"/>
-                <w:sz w:val="18"/>
-                <w:szCs w:val="18"/>
-              </w:rPr>
-              <w:t xml:space="preserve">${ </w:t>
-            </w:r>
-            <w:proofErr w:type="spellStart"/>
-            <w:r>
-              <w:rPr>
-                <w:rFonts w:ascii="BC Sans" w:eastAsia="BC Sans" w:hAnsi="BC Sans" w:cs="BC Sans"/>
-                <w:color w:val="000000"/>
-                <w:sz w:val="18"/>
-                <w:szCs w:val="18"/>
-              </w:rPr>
-              <w:t>d</w:t>
-            </w:r>
-            <w:proofErr w:type="gramEnd"/>
-            <w:r>
-              <w:rPr>
-                <w:rFonts w:ascii="BC Sans" w:eastAsia="BC Sans" w:hAnsi="BC Sans" w:cs="BC Sans"/>
-                <w:color w:val="000000"/>
-                <w:sz w:val="18"/>
-                <w:szCs w:val="18"/>
-              </w:rPr>
-              <w:t>.</w:t>
-            </w:r>
-            <w:proofErr w:type="gramStart"/>
-            <w:r>
-              <w:rPr>
-                <w:rFonts w:ascii="BC Sans" w:eastAsia="BC Sans" w:hAnsi="BC Sans" w:cs="BC Sans"/>
-                <w:color w:val="000000"/>
-                <w:sz w:val="18"/>
-                <w:szCs w:val="18"/>
-              </w:rPr>
-              <w:t>iaopreparinghrs:add</w:t>
-            </w:r>
-            <w:proofErr w:type="spellEnd"/>
-            <w:r>
-              <w:rPr>
-                <w:rFonts w:ascii="BC Sans" w:eastAsia="BC Sans" w:hAnsi="BC Sans" w:cs="BC Sans"/>
-                <w:color w:val="000000"/>
-                <w:sz w:val="18"/>
-                <w:szCs w:val="18"/>
-              </w:rPr>
-              <w:t>(.</w:t>
-            </w:r>
-            <w:proofErr w:type="spellStart"/>
-            <w:r>
-              <w:rPr>
-                <w:rFonts w:ascii="BC Sans" w:eastAsia="BC Sans" w:hAnsi="BC Sans" w:cs="BC Sans"/>
-                <w:color w:val="000000"/>
-                <w:sz w:val="18"/>
-                <w:szCs w:val="18"/>
-              </w:rPr>
-              <w:t>ministrypreparinghrs</w:t>
-            </w:r>
-            <w:proofErr w:type="spellEnd"/>
-            <w:r>
-              <w:rPr>
-                <w:rFonts w:ascii="BC Sans" w:eastAsia="BC Sans" w:hAnsi="BC Sans" w:cs="BC Sans"/>
-                <w:color w:val="000000"/>
-                <w:sz w:val="18"/>
-                <w:szCs w:val="18"/>
-              </w:rPr>
-              <w:t>):</w:t>
-            </w:r>
-            <w:proofErr w:type="spellStart"/>
-            <w:r>
-              <w:rPr>
-                <w:rFonts w:ascii="BC Sans" w:eastAsia="BC Sans" w:hAnsi="BC Sans" w:cs="BC Sans"/>
-                <w:color w:val="000000"/>
-                <w:sz w:val="18"/>
-                <w:szCs w:val="18"/>
-              </w:rPr>
-              <w:t>mul</w:t>
-            </w:r>
-            <w:proofErr w:type="spellEnd"/>
-            <w:proofErr w:type="gramEnd"/>
-            <w:r>
-              <w:rPr>
-                <w:rFonts w:ascii="BC Sans" w:eastAsia="BC Sans" w:hAnsi="BC Sans" w:cs="BC Sans"/>
-                <w:color w:val="000000"/>
-                <w:sz w:val="18"/>
-                <w:szCs w:val="18"/>
-              </w:rPr>
-              <w:t>(30</w:t>
-            </w:r>
-            <w:proofErr w:type="gramStart"/>
-            <w:r>
-              <w:rPr>
-                <w:rFonts w:ascii="BC Sans" w:eastAsia="BC Sans" w:hAnsi="BC Sans" w:cs="BC Sans"/>
-                <w:color w:val="000000"/>
-                <w:sz w:val="18"/>
-                <w:szCs w:val="18"/>
-              </w:rPr>
-              <w:t>):</w:t>
-            </w:r>
-            <w:proofErr w:type="spellStart"/>
-            <w:r>
-              <w:rPr>
-                <w:rFonts w:ascii="BC Sans" w:eastAsia="BC Sans" w:hAnsi="BC Sans" w:cs="BC Sans"/>
-                <w:color w:val="000000"/>
-                <w:sz w:val="18"/>
-                <w:szCs w:val="18"/>
-              </w:rPr>
-              <w:t>formatN</w:t>
-            </w:r>
-            <w:proofErr w:type="spellEnd"/>
-            <w:proofErr w:type="gramEnd"/>
-            <w:r>
-              <w:rPr>
-                <w:rFonts w:ascii="BC Sans" w:eastAsia="BC Sans" w:hAnsi="BC Sans" w:cs="BC Sans"/>
-                <w:color w:val="000000"/>
-                <w:sz w:val="18"/>
-                <w:szCs w:val="18"/>
-              </w:rPr>
-              <w:t>(2)}</w:t>
+            <w:r>
+              <w:rPr>
+                <w:rFonts w:ascii="BC Sans" w:eastAsia="BC Sans" w:hAnsi="BC Sans" w:cs="BC Sans"/>
+                <w:color w:val="000000"/>
+                <w:sz w:val="18"/>
+                <w:szCs w:val="18"/>
+              </w:rPr>
+              <w:t>${ d.iaopreparinghrs:add(.ministrypreparinghrs):mul(30):formatN(2)}</w:t>
             </w:r>
           </w:p>
         </w:tc>
@@ -2211,18 +1481,7 @@
                 <w:sz w:val="18"/>
                 <w:szCs w:val="18"/>
               </w:rPr>
-              <w:t>{</w:t>
-            </w:r>
-            <w:proofErr w:type="spellStart"/>
-            <w:proofErr w:type="gramStart"/>
-            <w:r>
-              <w:rPr>
-                <w:rFonts w:ascii="BC Sans" w:eastAsia="BC Sans" w:hAnsi="BC Sans" w:cs="BC Sans"/>
-                <w:color w:val="000000"/>
-                <w:sz w:val="18"/>
-                <w:szCs w:val="18"/>
-              </w:rPr>
-              <w:t>d.</w:t>
+              <w:t>{d.</w:t>
             </w:r>
             <w:r>
               <w:rPr>
@@ -2233,8 +1492,6 @@
               </w:rPr>
               <w:t>hardcopypages</w:t>
             </w:r>
-            <w:proofErr w:type="spellEnd"/>
-            <w:proofErr w:type="gramEnd"/>
             <w:r>
               <w:rPr>
                 <w:rFonts w:ascii="BC Sans" w:eastAsia="BC Sans" w:hAnsi="BC Sans" w:cs="BC Sans"/>
@@ -2300,18 +1557,7 @@
                 <w:sz w:val="18"/>
                 <w:szCs w:val="18"/>
               </w:rPr>
-              <w:t>${</w:t>
-            </w:r>
-            <w:proofErr w:type="spellStart"/>
-            <w:proofErr w:type="gramStart"/>
-            <w:r>
-              <w:rPr>
-                <w:rFonts w:ascii="BC Sans" w:eastAsia="BC Sans" w:hAnsi="BC Sans" w:cs="BC Sans"/>
-                <w:color w:val="000000"/>
-                <w:sz w:val="18"/>
-                <w:szCs w:val="18"/>
-              </w:rPr>
-              <w:t>d.</w:t>
+              <w:t>${d.</w:t>
             </w:r>
             <w:r>
               <w:rPr>
@@ -2322,37 +1568,15 @@
               </w:rPr>
               <w:t>hardcopypages</w:t>
             </w:r>
-            <w:proofErr w:type="gramEnd"/>
-            <w:r>
-              <w:rPr>
-                <w:rFonts w:ascii="BC Sans" w:eastAsia="BC Sans" w:hAnsi="BC Sans" w:cs="BC Sans"/>
-                <w:color w:val="000000"/>
-                <w:sz w:val="18"/>
-                <w:szCs w:val="18"/>
-              </w:rPr>
-              <w:t>:</w:t>
-            </w:r>
-            <w:proofErr w:type="gramStart"/>
-            <w:r>
-              <w:rPr>
-                <w:rFonts w:ascii="BC Sans" w:eastAsia="BC Sans" w:hAnsi="BC Sans" w:cs="BC Sans"/>
-                <w:color w:val="000000"/>
-                <w:sz w:val="18"/>
-                <w:szCs w:val="18"/>
-              </w:rPr>
-              <w:t>mul</w:t>
-            </w:r>
-            <w:proofErr w:type="spellEnd"/>
-            <w:r>
-              <w:rPr>
-                <w:rFonts w:ascii="BC Sans" w:eastAsia="BC Sans" w:hAnsi="BC Sans" w:cs="BC Sans"/>
-                <w:color w:val="000000"/>
-                <w:sz w:val="18"/>
-                <w:szCs w:val="18"/>
-              </w:rPr>
-              <w:t>(</w:t>
-            </w:r>
-            <w:proofErr w:type="gramEnd"/>
+            <w:r>
+              <w:rPr>
+                <w:rFonts w:ascii="BC Sans" w:eastAsia="BC Sans" w:hAnsi="BC Sans" w:cs="BC Sans"/>
+                <w:color w:val="000000"/>
+                <w:sz w:val="18"/>
+                <w:szCs w:val="18"/>
+              </w:rPr>
+              <w:t>:mul(</w:t>
+            </w:r>
             <w:r>
               <w:rPr>
                 <w:rFonts w:ascii="BC Sans" w:eastAsia="BC Sans" w:hAnsi="BC Sans" w:cs="BC Sans"/>
@@ -2362,36 +1586,14 @@
               </w:rPr>
               <w:t>0.1</w:t>
             </w:r>
-            <w:proofErr w:type="gramStart"/>
-            <w:r>
-              <w:rPr>
-                <w:rFonts w:ascii="BC Sans" w:eastAsia="BC Sans" w:hAnsi="BC Sans" w:cs="BC Sans"/>
-                <w:color w:val="000000"/>
-                <w:sz w:val="18"/>
-                <w:szCs w:val="18"/>
-              </w:rPr>
-              <w:t>):</w:t>
-            </w:r>
-            <w:proofErr w:type="spellStart"/>
-            <w:r>
-              <w:rPr>
-                <w:rFonts w:ascii="BC Sans" w:eastAsia="BC Sans" w:hAnsi="BC Sans" w:cs="BC Sans"/>
-                <w:color w:val="000000"/>
-                <w:sz w:val="18"/>
-                <w:szCs w:val="18"/>
-              </w:rPr>
-              <w:t>formatN</w:t>
-            </w:r>
-            <w:proofErr w:type="spellEnd"/>
-            <w:proofErr w:type="gramEnd"/>
-            <w:r>
-              <w:rPr>
-                <w:rFonts w:ascii="BC Sans" w:eastAsia="BC Sans" w:hAnsi="BC Sans" w:cs="BC Sans"/>
-                <w:color w:val="000000"/>
-                <w:sz w:val="18"/>
-                <w:szCs w:val="18"/>
-              </w:rPr>
-              <w:t>(2)}</w:t>
+            <w:r>
+              <w:rPr>
+                <w:rFonts w:ascii="BC Sans" w:eastAsia="BC Sans" w:hAnsi="BC Sans" w:cs="BC Sans"/>
+                <w:color w:val="000000"/>
+                <w:sz w:val="18"/>
+                <w:szCs w:val="18"/>
+              </w:rPr>
+              <w:t>):formatN(2)}</w:t>
             </w:r>
           </w:p>
         </w:tc>
@@ -2449,18 +1651,7 @@
                 <w:sz w:val="18"/>
                 <w:szCs w:val="18"/>
               </w:rPr>
-              <w:t>${</w:t>
-            </w:r>
-            <w:proofErr w:type="spellStart"/>
-            <w:proofErr w:type="gramStart"/>
-            <w:r>
-              <w:rPr>
-                <w:rFonts w:ascii="BC Sans" w:eastAsia="BC Sans" w:hAnsi="BC Sans" w:cs="BC Sans"/>
-                <w:color w:val="000000"/>
-                <w:sz w:val="18"/>
-                <w:szCs w:val="18"/>
-              </w:rPr>
-              <w:t>d.</w:t>
+              <w:t>${d.</w:t>
             </w:r>
             <w:r>
               <w:rPr>
@@ -2471,37 +1662,15 @@
               </w:rPr>
               <w:t>hardcopypages</w:t>
             </w:r>
-            <w:proofErr w:type="gramEnd"/>
-            <w:r>
-              <w:rPr>
-                <w:rFonts w:ascii="BC Sans" w:eastAsia="BC Sans" w:hAnsi="BC Sans" w:cs="BC Sans"/>
-                <w:color w:val="000000"/>
-                <w:sz w:val="18"/>
-                <w:szCs w:val="18"/>
-              </w:rPr>
-              <w:t>:</w:t>
-            </w:r>
-            <w:proofErr w:type="gramStart"/>
-            <w:r>
-              <w:rPr>
-                <w:rFonts w:ascii="BC Sans" w:eastAsia="BC Sans" w:hAnsi="BC Sans" w:cs="BC Sans"/>
-                <w:color w:val="000000"/>
-                <w:sz w:val="18"/>
-                <w:szCs w:val="18"/>
-              </w:rPr>
-              <w:t>mul</w:t>
-            </w:r>
-            <w:proofErr w:type="spellEnd"/>
-            <w:r>
-              <w:rPr>
-                <w:rFonts w:ascii="BC Sans" w:eastAsia="BC Sans" w:hAnsi="BC Sans" w:cs="BC Sans"/>
-                <w:color w:val="000000"/>
-                <w:sz w:val="18"/>
-                <w:szCs w:val="18"/>
-              </w:rPr>
-              <w:t>(</w:t>
-            </w:r>
-            <w:proofErr w:type="gramEnd"/>
+            <w:r>
+              <w:rPr>
+                <w:rFonts w:ascii="BC Sans" w:eastAsia="BC Sans" w:hAnsi="BC Sans" w:cs="BC Sans"/>
+                <w:color w:val="000000"/>
+                <w:sz w:val="18"/>
+                <w:szCs w:val="18"/>
+              </w:rPr>
+              <w:t>:mul(</w:t>
+            </w:r>
             <w:r>
               <w:rPr>
                 <w:rFonts w:ascii="BC Sans" w:eastAsia="BC Sans" w:hAnsi="BC Sans" w:cs="BC Sans"/>
@@ -2511,36 +1680,14 @@
               </w:rPr>
               <w:t>0.1</w:t>
             </w:r>
-            <w:proofErr w:type="gramStart"/>
-            <w:r>
-              <w:rPr>
-                <w:rFonts w:ascii="BC Sans" w:eastAsia="BC Sans" w:hAnsi="BC Sans" w:cs="BC Sans"/>
-                <w:color w:val="000000"/>
-                <w:sz w:val="18"/>
-                <w:szCs w:val="18"/>
-              </w:rPr>
-              <w:t>):</w:t>
-            </w:r>
-            <w:proofErr w:type="spellStart"/>
-            <w:r>
-              <w:rPr>
-                <w:rFonts w:ascii="BC Sans" w:eastAsia="BC Sans" w:hAnsi="BC Sans" w:cs="BC Sans"/>
-                <w:color w:val="000000"/>
-                <w:sz w:val="18"/>
-                <w:szCs w:val="18"/>
-              </w:rPr>
-              <w:t>formatN</w:t>
-            </w:r>
-            <w:proofErr w:type="spellEnd"/>
-            <w:proofErr w:type="gramEnd"/>
-            <w:r>
-              <w:rPr>
-                <w:rFonts w:ascii="BC Sans" w:eastAsia="BC Sans" w:hAnsi="BC Sans" w:cs="BC Sans"/>
-                <w:color w:val="000000"/>
-                <w:sz w:val="18"/>
-                <w:szCs w:val="18"/>
-              </w:rPr>
-              <w:t>(2)}</w:t>
+            <w:r>
+              <w:rPr>
+                <w:rFonts w:ascii="BC Sans" w:eastAsia="BC Sans" w:hAnsi="BC Sans" w:cs="BC Sans"/>
+                <w:color w:val="000000"/>
+                <w:sz w:val="18"/>
+                <w:szCs w:val="18"/>
+              </w:rPr>
+              <w:t>):formatN(2)}</w:t>
             </w:r>
           </w:p>
         </w:tc>
@@ -2742,19 +1889,7 @@
                 <w:sz w:val="18"/>
                 <w:szCs w:val="18"/>
               </w:rPr>
-              <w:t>${</w:t>
-            </w:r>
-            <w:proofErr w:type="spellStart"/>
-            <w:proofErr w:type="gramStart"/>
-            <w:r>
-              <w:rPr>
-                <w:rFonts w:ascii="BC Sans" w:eastAsia="BC Sans" w:hAnsi="BC Sans" w:cs="BC Sans"/>
-                <w:b/>
-                <w:color w:val="0A3266"/>
-                <w:sz w:val="18"/>
-                <w:szCs w:val="18"/>
-              </w:rPr>
-              <w:t>d.</w:t>
+              <w:t>${d.</w:t>
             </w:r>
             <w:r>
               <w:rPr>
@@ -2766,49 +1901,15 @@
               </w:rPr>
               <w:t>totaldue</w:t>
             </w:r>
-            <w:proofErr w:type="gramEnd"/>
-            <w:r>
-              <w:rPr>
-                <w:rFonts w:ascii="BC Sans" w:eastAsia="BC Sans" w:hAnsi="BC Sans" w:cs="BC Sans"/>
-                <w:b/>
-                <w:color w:val="0A3266"/>
-                <w:sz w:val="18"/>
-                <w:szCs w:val="18"/>
-              </w:rPr>
-              <w:t>:</w:t>
-            </w:r>
-            <w:proofErr w:type="gramStart"/>
-            <w:r>
-              <w:rPr>
-                <w:rFonts w:ascii="BC Sans" w:eastAsia="BC Sans" w:hAnsi="BC Sans" w:cs="BC Sans"/>
-                <w:b/>
-                <w:color w:val="0A3266"/>
-                <w:sz w:val="18"/>
-                <w:szCs w:val="18"/>
-              </w:rPr>
-              <w:t>formatN</w:t>
-            </w:r>
-            <w:proofErr w:type="spellEnd"/>
-            <w:r>
-              <w:rPr>
-                <w:rFonts w:ascii="BC Sans" w:eastAsia="BC Sans" w:hAnsi="BC Sans" w:cs="BC Sans"/>
-                <w:b/>
-                <w:color w:val="0A3266"/>
-                <w:sz w:val="18"/>
-                <w:szCs w:val="18"/>
-              </w:rPr>
-              <w:t>(</w:t>
-            </w:r>
-            <w:proofErr w:type="gramEnd"/>
-            <w:r>
-              <w:rPr>
-                <w:rFonts w:ascii="BC Sans" w:eastAsia="BC Sans" w:hAnsi="BC Sans" w:cs="BC Sans"/>
-                <w:b/>
-                <w:color w:val="0A3266"/>
-                <w:sz w:val="18"/>
-                <w:szCs w:val="18"/>
-              </w:rPr>
-              <w:t>2)</w:t>
+            <w:r>
+              <w:rPr>
+                <w:rFonts w:ascii="BC Sans" w:eastAsia="BC Sans" w:hAnsi="BC Sans" w:cs="BC Sans"/>
+                <w:b/>
+                <w:color w:val="0A3266"/>
+                <w:sz w:val="18"/>
+                <w:szCs w:val="18"/>
+              </w:rPr>
+              <w:t>:formatN(2)</w:t>
             </w:r>
             <w:r>
               <w:rPr>
@@ -2991,31 +2092,7 @@
                 <w:sz w:val="18"/>
                 <w:szCs w:val="18"/>
               </w:rPr>
-              <w:t>${</w:t>
-            </w:r>
-            <w:proofErr w:type="spellStart"/>
-            <w:proofErr w:type="gramStart"/>
-            <w:r>
-              <w:rPr>
-                <w:rFonts w:ascii="BC Sans" w:eastAsia="BC Sans" w:hAnsi="BC Sans" w:cs="BC Sans"/>
-                <w:b/>
-                <w:color w:val="0A3266"/>
-                <w:sz w:val="18"/>
-                <w:szCs w:val="18"/>
-              </w:rPr>
-              <w:t>d.addWaivedAmount</w:t>
-            </w:r>
-            <w:proofErr w:type="spellEnd"/>
-            <w:proofErr w:type="gramEnd"/>
-            <w:r>
-              <w:rPr>
-                <w:rFonts w:ascii="BC Sans" w:eastAsia="BC Sans" w:hAnsi="BC Sans" w:cs="BC Sans"/>
-                <w:b/>
-                <w:color w:val="0A3266"/>
-                <w:sz w:val="18"/>
-                <w:szCs w:val="18"/>
-              </w:rPr>
-              <w:t>}</w:t>
+              <w:t>${d.addWaivedAmount}</w:t>
             </w:r>
           </w:p>
         </w:tc>
@@ -3185,31 +2262,7 @@
                 <w:sz w:val="18"/>
                 <w:szCs w:val="18"/>
               </w:rPr>
-              <w:t>${</w:t>
-            </w:r>
-            <w:proofErr w:type="spellStart"/>
-            <w:proofErr w:type="gramStart"/>
-            <w:r>
-              <w:rPr>
-                <w:rFonts w:ascii="BC Sans" w:eastAsia="BC Sans" w:hAnsi="BC Sans" w:cs="BC Sans"/>
-                <w:b/>
-                <w:color w:val="0A3266"/>
-                <w:sz w:val="18"/>
-                <w:szCs w:val="18"/>
-              </w:rPr>
-              <w:t>d.amountpaid</w:t>
-            </w:r>
-            <w:proofErr w:type="spellEnd"/>
-            <w:proofErr w:type="gramEnd"/>
-            <w:r>
-              <w:rPr>
-                <w:rFonts w:ascii="BC Sans" w:eastAsia="BC Sans" w:hAnsi="BC Sans" w:cs="BC Sans"/>
-                <w:b/>
-                <w:color w:val="0A3266"/>
-                <w:sz w:val="18"/>
-                <w:szCs w:val="18"/>
-              </w:rPr>
-              <w:t>}</w:t>
+              <w:t>${d.amountpaid}</w:t>
             </w:r>
           </w:p>
         </w:tc>
@@ -3359,31 +2412,7 @@
                 <w:sz w:val="18"/>
                 <w:szCs w:val="18"/>
               </w:rPr>
-              <w:t>${</w:t>
-            </w:r>
-            <w:proofErr w:type="spellStart"/>
-            <w:proofErr w:type="gramStart"/>
-            <w:r>
-              <w:rPr>
-                <w:rFonts w:ascii="BC Sans" w:eastAsia="BC Sans" w:hAnsi="BC Sans" w:cs="BC Sans"/>
-                <w:b/>
-                <w:color w:val="0A3266"/>
-                <w:sz w:val="18"/>
-                <w:szCs w:val="18"/>
-              </w:rPr>
-              <w:t>d.balancedue</w:t>
-            </w:r>
-            <w:proofErr w:type="spellEnd"/>
-            <w:proofErr w:type="gramEnd"/>
-            <w:r>
-              <w:rPr>
-                <w:rFonts w:ascii="BC Sans" w:eastAsia="BC Sans" w:hAnsi="BC Sans" w:cs="BC Sans"/>
-                <w:b/>
-                <w:color w:val="0A3266"/>
-                <w:sz w:val="18"/>
-                <w:szCs w:val="18"/>
-              </w:rPr>
-              <w:t>}</w:t>
+              <w:t>${d.balancedue}</w:t>
             </w:r>
           </w:p>
         </w:tc>
@@ -3556,35 +2585,7 @@
           <w:sz w:val="14"/>
           <w:szCs w:val="14"/>
         </w:rPr>
-        <w:t>{</w:t>
-      </w:r>
-      <w:proofErr w:type="spellStart"/>
-      <w:proofErr w:type="gramStart"/>
-      <w:r>
-        <w:rPr>
-          <w:rFonts w:ascii="BC Sans" w:eastAsia="BC Sans" w:hAnsi="BC Sans" w:cs="BC Sans"/>
-          <w:sz w:val="14"/>
-          <w:szCs w:val="14"/>
-        </w:rPr>
-        <w:t>d.request</w:t>
-      </w:r>
-      <w:proofErr w:type="gramEnd"/>
-      <w:r>
-        <w:rPr>
-          <w:rFonts w:ascii="BC Sans" w:eastAsia="BC Sans" w:hAnsi="BC Sans" w:cs="BC Sans"/>
-          <w:sz w:val="14"/>
-          <w:szCs w:val="14"/>
-        </w:rPr>
-        <w:t>_description</w:t>
-      </w:r>
-      <w:proofErr w:type="spellEnd"/>
-      <w:r>
-        <w:rPr>
-          <w:rFonts w:ascii="BC Sans" w:eastAsia="BC Sans" w:hAnsi="BC Sans" w:cs="BC Sans"/>
-          <w:sz w:val="14"/>
-          <w:szCs w:val="14"/>
-        </w:rPr>
-        <w:t>}</w:t>
+        <w:t>{d.request_description}</w:t>
       </w:r>
     </w:p>
     <w:p>
@@ -3636,35 +2637,7 @@
           <w:sz w:val="14"/>
           <w:szCs w:val="14"/>
         </w:rPr>
-        <w:t>{</w:t>
-      </w:r>
-      <w:proofErr w:type="spellStart"/>
-      <w:proofErr w:type="gramStart"/>
-      <w:r>
-        <w:rPr>
-          <w:rFonts w:ascii="BC Sans" w:eastAsia="BC Sans" w:hAnsi="BC Sans" w:cs="BC Sans"/>
-          <w:sz w:val="14"/>
-          <w:szCs w:val="14"/>
-        </w:rPr>
-        <w:t>d.invoice</w:t>
-      </w:r>
-      <w:proofErr w:type="gramEnd"/>
-      <w:r>
-        <w:rPr>
-          <w:rFonts w:ascii="BC Sans" w:eastAsia="BC Sans" w:hAnsi="BC Sans" w:cs="BC Sans"/>
-          <w:sz w:val="14"/>
-          <w:szCs w:val="14"/>
-        </w:rPr>
-        <w:t>_memo</w:t>
-      </w:r>
-      <w:proofErr w:type="spellEnd"/>
-      <w:r>
-        <w:rPr>
-          <w:rFonts w:ascii="BC Sans" w:eastAsia="BC Sans" w:hAnsi="BC Sans" w:cs="BC Sans"/>
-          <w:sz w:val="14"/>
-          <w:szCs w:val="14"/>
-        </w:rPr>
-        <w:t>}</w:t>
+        <w:t>{d.invoice_memo}</w:t>
       </w:r>
     </w:p>
     <w:p>
@@ -3681,12 +2654,8 @@
       </w:pPr>
     </w:p>
     <w:sectPr>
-      <w:headerReference w:type="even" r:id="rId8"/>
-      <w:headerReference w:type="default" r:id="rId9"/>
-      <w:footerReference w:type="even" r:id="rId10"/>
-      <w:footerReference w:type="default" r:id="rId11"/>
-      <w:headerReference w:type="first" r:id="rId12"/>
-      <w:footerReference w:type="first" r:id="rId13"/>
+      <w:headerReference w:type="default" r:id="rId8"/>
+      <w:footerReference w:type="default" r:id="rId9"/>
       <w:pgSz w:w="12240" w:h="15840"/>
       <w:pgMar w:top="1440" w:right="1440" w:bottom="1440" w:left="1440" w:header="708" w:footer="708" w:gutter="0"/>
       <w:pgNumType w:start="1"/>
@@ -3716,16 +2685,6 @@
 </file>
 
 <file path=word/footer1.xml><?xml version="1.0" encoding="utf-8"?>
-<w:ftr xmlns:wpc="http://schemas.microsoft.com/office/word/2010/wordprocessingCanvas" xmlns:cx="http://schemas.microsoft.com/office/drawing/2014/chartex" xmlns:cx1="http://schemas.microsoft.com/office/drawing/2015/9/8/chartex" xmlns:cx2="http://schemas.microsoft.com/office/drawing/2015/10/21/chartex" xmlns:cx3="http://schemas.microsoft.com/office/drawing/2016/5/9/chartex" xmlns:cx4="http://schemas.microsoft.com/office/drawing/2016/5/10/chartex" xmlns:cx5="http://schemas.microsoft.com/office/drawing/2016/5/11/chartex" xmlns:cx6="http://schemas.microsoft.com/office/drawing/2016/5/12/chartex" xmlns:cx7="http://schemas.microsoft.com/office/drawing/2016/5/13/chartex" xmlns:cx8="http://schemas.microsoft.com/office/drawing/2016/5/14/chartex" xmlns:mc="http://schemas.openxmlformats.org/markup-compatibility/2006" xmlns:aink="http://schemas.microsoft.com/office/drawing/2016/ink" xmlns:am3d="http://schemas.microsoft.com/office/drawing/2017/model3d" xmlns:o="urn:schemas-microsoft-com:office:office" xmlns:oel="http://schemas.microsoft.com/office/2019/extlst" xmlns:r="http://schemas.openxmlformats.org/officeDocument/2006/relationships" xmlns:m="http://schemas.openxmlformats.org/officeDocument/2006/math" xmlns:v="urn:schemas-microsoft-com:vml" xmlns:wp14="http://schemas.microsoft.com/office/word/2010/wordprocessingDrawing" xmlns:wp="http://schemas.openxmlformats.org/drawingml/2006/wordprocessingDrawing" xmlns:w10="urn:schemas-microsoft-com:office:word" xmlns:w="http://schemas.openxmlformats.org/wordprocessingml/2006/main" xmlns:w14="http://schemas.microsoft.com/office/word/2010/wordml" xmlns:w15="http://schemas.microsoft.com/office/word/2012/wordml" xmlns:w16cex="http://schemas.microsoft.com/office/word/2018/wordml/cex" xmlns:w16cid="http://schemas.microsoft.com/office/word/2016/wordml/cid" xmlns:w16="http://schemas.microsoft.com/office/word/2018/wordml" xmlns:w16du="http://schemas.microsoft.com/office/word/2023/wordml/word16du" xmlns:w16sdtdh="http://schemas.microsoft.com/office/word/2020/wordml/sdtdatahash" xmlns:w16sdtfl="http://schemas.microsoft.com/office/word/2024/wordml/sdtformatlock" xmlns:w16se="http://schemas.microsoft.com/office/word/2015/wordml/symex" xmlns:wpg="http://schemas.microsoft.com/office/word/2010/wordprocessingGroup" xmlns:wpi="http://schemas.microsoft.com/office/word/2010/wordprocessingInk" xmlns:wne="http://schemas.microsoft.com/office/word/2006/wordml" xmlns:wps="http://schemas.microsoft.com/office/word/2010/wordprocessingShape" mc:Ignorable="w14 w15 w16se w16cid w16 w16cex w16sdtdh w16sdtfl w16du wp14">
-  <w:p>
-    <w:pPr>
-      <w:pStyle w:val="Footer"/>
-    </w:pPr>
-  </w:p>
-</w:ftr>
-</file>
-
-<file path=word/footer2.xml><?xml version="1.0" encoding="utf-8"?>
 <w:ftr xmlns:wpc="http://schemas.microsoft.com/office/word/2010/wordprocessingCanvas" xmlns:cx="http://schemas.microsoft.com/office/drawing/2014/chartex" xmlns:cx1="http://schemas.microsoft.com/office/drawing/2015/9/8/chartex" xmlns:cx2="http://schemas.microsoft.com/office/drawing/2015/10/21/chartex" xmlns:cx3="http://schemas.microsoft.com/office/drawing/2016/5/9/chartex" xmlns:cx4="http://schemas.microsoft.com/office/drawing/2016/5/10/chartex" xmlns:cx5="http://schemas.microsoft.com/office/drawing/2016/5/11/chartex" xmlns:cx6="http://schemas.microsoft.com/office/drawing/2016/5/12/chartex" xmlns:cx7="http://schemas.microsoft.com/office/drawing/2016/5/13/chartex" xmlns:cx8="http://schemas.microsoft.com/office/drawing/2016/5/14/chartex" xmlns:mc="http://schemas.openxmlformats.org/markup-compatibility/2006" xmlns:aink="http://schemas.microsoft.com/office/drawing/2016/ink" xmlns:am3d="http://schemas.microsoft.com/office/drawing/2017/model3d" xmlns:o="urn:schemas-microsoft-com:office:office" xmlns:oel="http://schemas.microsoft.com/office/2019/extlst" xmlns:r="http://schemas.openxmlformats.org/officeDocument/2006/relationships" xmlns:m="http://schemas.openxmlformats.org/officeDocument/2006/math" xmlns:v="urn:schemas-microsoft-com:vml" xmlns:wp14="http://schemas.microsoft.com/office/word/2010/wordprocessingDrawing" xmlns:wp="http://schemas.openxmlformats.org/drawingml/2006/wordprocessingDrawing" xmlns:w10="urn:schemas-microsoft-com:office:word" xmlns:w="http://schemas.openxmlformats.org/wordprocessingml/2006/main" xmlns:w14="http://schemas.microsoft.com/office/word/2010/wordml" xmlns:w15="http://schemas.microsoft.com/office/word/2012/wordml" xmlns:w16cex="http://schemas.microsoft.com/office/word/2018/wordml/cex" xmlns:w16cid="http://schemas.microsoft.com/office/word/2016/wordml/cid" xmlns:w16="http://schemas.microsoft.com/office/word/2018/wordml" xmlns:w16du="http://schemas.microsoft.com/office/word/2023/wordml/word16du" xmlns:w16sdtdh="http://schemas.microsoft.com/office/word/2020/wordml/sdtdatahash" xmlns:w16sdtfl="http://schemas.microsoft.com/office/word/2024/wordml/sdtformatlock" xmlns:w16se="http://schemas.microsoft.com/office/word/2015/wordml/symex" xmlns:wpg="http://schemas.microsoft.com/office/word/2010/wordprocessingGroup" xmlns:wpi="http://schemas.microsoft.com/office/word/2010/wordprocessingInk" xmlns:wne="http://schemas.microsoft.com/office/word/2006/wordml" xmlns:wps="http://schemas.microsoft.com/office/word/2010/wordprocessingShape" mc:Ignorable="w14 w15 w16se w16cid w16 w16cex w16sdtdh w16sdtfl w16du wp14">
   <w:p>
     <w:pPr>
@@ -3913,7 +2872,7 @@
               <w:sz w:val="15"/>
               <w:szCs w:val="15"/>
             </w:rPr>
-            <w:t>Access &amp; Information Management Branch</w:t>
+            <w:t>FOI</w:t>
           </w:r>
           <w:r>
             <w:rPr>
@@ -3921,7 +2880,7 @@
               <w:sz w:val="15"/>
               <w:szCs w:val="15"/>
             </w:rPr>
-            <w:t xml:space="preserve">                 </w:t>
+            <w:t xml:space="preserve"> Operations                 </w:t>
           </w:r>
         </w:p>
         <w:p>
@@ -3990,25 +2949,7 @@
               <w:sz w:val="15"/>
               <w:szCs w:val="15"/>
             </w:rPr>
-            <w:t xml:space="preserve">PO Box 9569 </w:t>
-          </w:r>
-          <w:proofErr w:type="spellStart"/>
-          <w:r>
-            <w:rPr>
-              <w:rFonts w:ascii="BC Sans" w:eastAsia="Times New Roman" w:hAnsi="BC Sans" w:cs="Times New Roman"/>
-              <w:sz w:val="15"/>
-              <w:szCs w:val="15"/>
-            </w:rPr>
-            <w:t>Stn</w:t>
-          </w:r>
-          <w:proofErr w:type="spellEnd"/>
-          <w:r>
-            <w:rPr>
-              <w:rFonts w:ascii="BC Sans" w:eastAsia="Times New Roman" w:hAnsi="BC Sans" w:cs="Times New Roman"/>
-              <w:sz w:val="15"/>
-              <w:szCs w:val="15"/>
-            </w:rPr>
-            <w:t xml:space="preserve"> Prov Govt               </w:t>
+            <w:t xml:space="preserve">PO Box 9569 Stn Prov Govt               </w:t>
           </w:r>
         </w:p>
         <w:p>
@@ -4029,25 +2970,7 @@
               <w:sz w:val="15"/>
               <w:szCs w:val="15"/>
             </w:rPr>
-            <w:t xml:space="preserve">Victoria </w:t>
-          </w:r>
-          <w:proofErr w:type="gramStart"/>
-          <w:r>
-            <w:rPr>
-              <w:rFonts w:ascii="BC Sans" w:eastAsia="Times New Roman" w:hAnsi="BC Sans" w:cs="Times New Roman"/>
-              <w:sz w:val="15"/>
-              <w:szCs w:val="15"/>
-            </w:rPr>
-            <w:t>BC  V</w:t>
-          </w:r>
-          <w:proofErr w:type="gramEnd"/>
-          <w:r>
-            <w:rPr>
-              <w:rFonts w:ascii="BC Sans" w:eastAsia="Times New Roman" w:hAnsi="BC Sans" w:cs="Times New Roman"/>
-              <w:sz w:val="15"/>
-              <w:szCs w:val="15"/>
-            </w:rPr>
-            <w:t>8W 9</w:t>
+            <w:t>Victoria BC  V8W 9</w:t>
           </w:r>
           <w:r>
             <w:rPr>
@@ -4190,7 +3113,6 @@
             </w:r>
           </w:hyperlink>
           <w:hyperlink r:id="rId4">
-            <w:proofErr w:type="spellStart"/>
             <w:r>
               <w:rPr>
                 <w:rFonts w:ascii="BC Sans" w:eastAsia="Times New Roman" w:hAnsi="BC Sans" w:cs="Times New Roman"/>
@@ -4199,18 +3121,7 @@
                 <w:szCs w:val="15"/>
                 <w:u w:val="single"/>
               </w:rPr>
-              <w:t>freedomofinformation</w:t>
-            </w:r>
-            <w:proofErr w:type="spellEnd"/>
-            <w:r>
-              <w:rPr>
-                <w:rFonts w:ascii="BC Sans" w:eastAsia="Times New Roman" w:hAnsi="BC Sans" w:cs="Times New Roman"/>
-                <w:color w:val="4F81BD" w:themeColor="accent1"/>
-                <w:sz w:val="15"/>
-                <w:szCs w:val="15"/>
-                <w:u w:val="single"/>
-              </w:rPr>
-              <w:t>/</w:t>
+              <w:t>freedomofinformation/</w:t>
             </w:r>
           </w:hyperlink>
         </w:p>
@@ -4559,16 +3470,6 @@
 </w:ftr>
 </file>
 
-<file path=word/footer3.xml><?xml version="1.0" encoding="utf-8"?>
-<w:ftr xmlns:wpc="http://schemas.microsoft.com/office/word/2010/wordprocessingCanvas" xmlns:cx="http://schemas.microsoft.com/office/drawing/2014/chartex" xmlns:cx1="http://schemas.microsoft.com/office/drawing/2015/9/8/chartex" xmlns:cx2="http://schemas.microsoft.com/office/drawing/2015/10/21/chartex" xmlns:cx3="http://schemas.microsoft.com/office/drawing/2016/5/9/chartex" xmlns:cx4="http://schemas.microsoft.com/office/drawing/2016/5/10/chartex" xmlns:cx5="http://schemas.microsoft.com/office/drawing/2016/5/11/chartex" xmlns:cx6="http://schemas.microsoft.com/office/drawing/2016/5/12/chartex" xmlns:cx7="http://schemas.microsoft.com/office/drawing/2016/5/13/chartex" xmlns:cx8="http://schemas.microsoft.com/office/drawing/2016/5/14/chartex" xmlns:mc="http://schemas.openxmlformats.org/markup-compatibility/2006" xmlns:aink="http://schemas.microsoft.com/office/drawing/2016/ink" xmlns:am3d="http://schemas.microsoft.com/office/drawing/2017/model3d" xmlns:o="urn:schemas-microsoft-com:office:office" xmlns:oel="http://schemas.microsoft.com/office/2019/extlst" xmlns:r="http://schemas.openxmlformats.org/officeDocument/2006/relationships" xmlns:m="http://schemas.openxmlformats.org/officeDocument/2006/math" xmlns:v="urn:schemas-microsoft-com:vml" xmlns:wp14="http://schemas.microsoft.com/office/word/2010/wordprocessingDrawing" xmlns:wp="http://schemas.openxmlformats.org/drawingml/2006/wordprocessingDrawing" xmlns:w10="urn:schemas-microsoft-com:office:word" xmlns:w="http://schemas.openxmlformats.org/wordprocessingml/2006/main" xmlns:w14="http://schemas.microsoft.com/office/word/2010/wordml" xmlns:w15="http://schemas.microsoft.com/office/word/2012/wordml" xmlns:w16cex="http://schemas.microsoft.com/office/word/2018/wordml/cex" xmlns:w16cid="http://schemas.microsoft.com/office/word/2016/wordml/cid" xmlns:w16="http://schemas.microsoft.com/office/word/2018/wordml" xmlns:w16du="http://schemas.microsoft.com/office/word/2023/wordml/word16du" xmlns:w16sdtdh="http://schemas.microsoft.com/office/word/2020/wordml/sdtdatahash" xmlns:w16sdtfl="http://schemas.microsoft.com/office/word/2024/wordml/sdtformatlock" xmlns:w16se="http://schemas.microsoft.com/office/word/2015/wordml/symex" xmlns:wpg="http://schemas.microsoft.com/office/word/2010/wordprocessingGroup" xmlns:wpi="http://schemas.microsoft.com/office/word/2010/wordprocessingInk" xmlns:wne="http://schemas.microsoft.com/office/word/2006/wordml" xmlns:wps="http://schemas.microsoft.com/office/word/2010/wordprocessingShape" mc:Ignorable="w14 w15 w16se w16cid w16 w16cex w16sdtdh w16sdtfl w16du wp14">
-  <w:p>
-    <w:pPr>
-      <w:pStyle w:val="Footer"/>
-    </w:pPr>
-  </w:p>
-</w:ftr>
-</file>
-
 <file path=word/footnotes.xml><?xml version="1.0" encoding="utf-8"?>
 <w:footnotes xmlns:wpc="http://schemas.microsoft.com/office/word/2010/wordprocessingCanvas" xmlns:cx="http://schemas.microsoft.com/office/drawing/2014/chartex" xmlns:cx1="http://schemas.microsoft.com/office/drawing/2015/9/8/chartex" xmlns:cx2="http://schemas.microsoft.com/office/drawing/2015/10/21/chartex" xmlns:cx3="http://schemas.microsoft.com/office/drawing/2016/5/9/chartex" xmlns:cx4="http://schemas.microsoft.com/office/drawing/2016/5/10/chartex" xmlns:cx5="http://schemas.microsoft.com/office/drawing/2016/5/11/chartex" xmlns:cx6="http://schemas.microsoft.com/office/drawing/2016/5/12/chartex" xmlns:cx7="http://schemas.microsoft.com/office/drawing/2016/5/13/chartex" xmlns:cx8="http://schemas.microsoft.com/office/drawing/2016/5/14/chartex" xmlns:mc="http://schemas.openxmlformats.org/markup-compatibility/2006" xmlns:aink="http://schemas.microsoft.com/office/drawing/2016/ink" xmlns:am3d="http://schemas.microsoft.com/office/drawing/2017/model3d" xmlns:o="urn:schemas-microsoft-com:office:office" xmlns:oel="http://schemas.microsoft.com/office/2019/extlst" xmlns:r="http://schemas.openxmlformats.org/officeDocument/2006/relationships" xmlns:m="http://schemas.openxmlformats.org/officeDocument/2006/math" xmlns:v="urn:schemas-microsoft-com:vml" xmlns:wp14="http://schemas.microsoft.com/office/word/2010/wordprocessingDrawing" xmlns:wp="http://schemas.openxmlformats.org/drawingml/2006/wordprocessingDrawing" xmlns:w10="urn:schemas-microsoft-com:office:word" xmlns:w="http://schemas.openxmlformats.org/wordprocessingml/2006/main" xmlns:w14="http://schemas.microsoft.com/office/word/2010/wordml" xmlns:w15="http://schemas.microsoft.com/office/word/2012/wordml" xmlns:w16cex="http://schemas.microsoft.com/office/word/2018/wordml/cex" xmlns:w16cid="http://schemas.microsoft.com/office/word/2016/wordml/cid" xmlns:w16="http://schemas.microsoft.com/office/word/2018/wordml" xmlns:w16du="http://schemas.microsoft.com/office/word/2023/wordml/word16du" xmlns:w16sdtdh="http://schemas.microsoft.com/office/word/2020/wordml/sdtdatahash" xmlns:w16sdtfl="http://schemas.microsoft.com/office/word/2024/wordml/sdtformatlock" xmlns:w16se="http://schemas.microsoft.com/office/word/2015/wordml/symex" xmlns:wpg="http://schemas.microsoft.com/office/word/2010/wordprocessingGroup" xmlns:wpi="http://schemas.microsoft.com/office/word/2010/wordprocessingInk" xmlns:wne="http://schemas.microsoft.com/office/word/2006/wordml" xmlns:wps="http://schemas.microsoft.com/office/word/2010/wordprocessingShape" mc:Ignorable="w14 w15 w16se w16cid w16 w16cex w16sdtdh w16sdtfl w16du wp14">
   <w:footnote w:type="separator" w:id="-1">
@@ -4589,16 +3490,6 @@
 </file>
 
 <file path=word/header1.xml><?xml version="1.0" encoding="utf-8"?>
-<w:hdr xmlns:wpc="http://schemas.microsoft.com/office/word/2010/wordprocessingCanvas" xmlns:cx="http://schemas.microsoft.com/office/drawing/2014/chartex" xmlns:cx1="http://schemas.microsoft.com/office/drawing/2015/9/8/chartex" xmlns:cx2="http://schemas.microsoft.com/office/drawing/2015/10/21/chartex" xmlns:cx3="http://schemas.microsoft.com/office/drawing/2016/5/9/chartex" xmlns:cx4="http://schemas.microsoft.com/office/drawing/2016/5/10/chartex" xmlns:cx5="http://schemas.microsoft.com/office/drawing/2016/5/11/chartex" xmlns:cx6="http://schemas.microsoft.com/office/drawing/2016/5/12/chartex" xmlns:cx7="http://schemas.microsoft.com/office/drawing/2016/5/13/chartex" xmlns:cx8="http://schemas.microsoft.com/office/drawing/2016/5/14/chartex" xmlns:mc="http://schemas.openxmlformats.org/markup-compatibility/2006" xmlns:aink="http://schemas.microsoft.com/office/drawing/2016/ink" xmlns:am3d="http://schemas.microsoft.com/office/drawing/2017/model3d" xmlns:o="urn:schemas-microsoft-com:office:office" xmlns:oel="http://schemas.microsoft.com/office/2019/extlst" xmlns:r="http://schemas.openxmlformats.org/officeDocument/2006/relationships" xmlns:m="http://schemas.openxmlformats.org/officeDocument/2006/math" xmlns:v="urn:schemas-microsoft-com:vml" xmlns:wp14="http://schemas.microsoft.com/office/word/2010/wordprocessingDrawing" xmlns:wp="http://schemas.openxmlformats.org/drawingml/2006/wordprocessingDrawing" xmlns:w10="urn:schemas-microsoft-com:office:word" xmlns:w="http://schemas.openxmlformats.org/wordprocessingml/2006/main" xmlns:w14="http://schemas.microsoft.com/office/word/2010/wordml" xmlns:w15="http://schemas.microsoft.com/office/word/2012/wordml" xmlns:w16cex="http://schemas.microsoft.com/office/word/2018/wordml/cex" xmlns:w16cid="http://schemas.microsoft.com/office/word/2016/wordml/cid" xmlns:w16="http://schemas.microsoft.com/office/word/2018/wordml" xmlns:w16du="http://schemas.microsoft.com/office/word/2023/wordml/word16du" xmlns:w16sdtdh="http://schemas.microsoft.com/office/word/2020/wordml/sdtdatahash" xmlns:w16sdtfl="http://schemas.microsoft.com/office/word/2024/wordml/sdtformatlock" xmlns:w16se="http://schemas.microsoft.com/office/word/2015/wordml/symex" xmlns:wpg="http://schemas.microsoft.com/office/word/2010/wordprocessingGroup" xmlns:wpi="http://schemas.microsoft.com/office/word/2010/wordprocessingInk" xmlns:wne="http://schemas.microsoft.com/office/word/2006/wordml" xmlns:wps="http://schemas.microsoft.com/office/word/2010/wordprocessingShape" mc:Ignorable="w14 w15 w16se w16cid w16 w16cex w16sdtdh w16sdtfl w16du wp14">
-  <w:p>
-    <w:pPr>
-      <w:pStyle w:val="Header"/>
-    </w:pPr>
-  </w:p>
-</w:hdr>
-</file>
-
-<file path=word/header2.xml><?xml version="1.0" encoding="utf-8"?>
 <w:hdr xmlns:wpc="http://schemas.microsoft.com/office/word/2010/wordprocessingCanvas" xmlns:cx="http://schemas.microsoft.com/office/drawing/2014/chartex" xmlns:cx1="http://schemas.microsoft.com/office/drawing/2015/9/8/chartex" xmlns:cx2="http://schemas.microsoft.com/office/drawing/2015/10/21/chartex" xmlns:cx3="http://schemas.microsoft.com/office/drawing/2016/5/9/chartex" xmlns:cx4="http://schemas.microsoft.com/office/drawing/2016/5/10/chartex" xmlns:cx5="http://schemas.microsoft.com/office/drawing/2016/5/11/chartex" xmlns:cx6="http://schemas.microsoft.com/office/drawing/2016/5/12/chartex" xmlns:cx7="http://schemas.microsoft.com/office/drawing/2016/5/13/chartex" xmlns:cx8="http://schemas.microsoft.com/office/drawing/2016/5/14/chartex" xmlns:mc="http://schemas.openxmlformats.org/markup-compatibility/2006" xmlns:aink="http://schemas.microsoft.com/office/drawing/2016/ink" xmlns:am3d="http://schemas.microsoft.com/office/drawing/2017/model3d" xmlns:o="urn:schemas-microsoft-com:office:office" xmlns:oel="http://schemas.microsoft.com/office/2019/extlst" xmlns:r="http://schemas.openxmlformats.org/officeDocument/2006/relationships" xmlns:m="http://schemas.openxmlformats.org/officeDocument/2006/math" xmlns:v="urn:schemas-microsoft-com:vml" xmlns:wp14="http://schemas.microsoft.com/office/word/2010/wordprocessingDrawing" xmlns:wp="http://schemas.openxmlformats.org/drawingml/2006/wordprocessingDrawing" xmlns:w10="urn:schemas-microsoft-com:office:word" xmlns:w="http://schemas.openxmlformats.org/wordprocessingml/2006/main" xmlns:w14="http://schemas.microsoft.com/office/word/2010/wordml" xmlns:w15="http://schemas.microsoft.com/office/word/2012/wordml" xmlns:w16cex="http://schemas.microsoft.com/office/word/2018/wordml/cex" xmlns:w16cid="http://schemas.microsoft.com/office/word/2016/wordml/cid" xmlns:w16="http://schemas.microsoft.com/office/word/2018/wordml" xmlns:w16du="http://schemas.microsoft.com/office/word/2023/wordml/word16du" xmlns:w16sdtdh="http://schemas.microsoft.com/office/word/2020/wordml/sdtdatahash" xmlns:w16sdtfl="http://schemas.microsoft.com/office/word/2024/wordml/sdtformatlock" xmlns:w16se="http://schemas.microsoft.com/office/word/2015/wordml/symex" xmlns:wpg="http://schemas.microsoft.com/office/word/2010/wordprocessingGroup" xmlns:wpi="http://schemas.microsoft.com/office/word/2010/wordprocessingInk" xmlns:wne="http://schemas.microsoft.com/office/word/2006/wordml" xmlns:wps="http://schemas.microsoft.com/office/word/2010/wordprocessingShape" mc:Ignorable="w14 w15 w16se w16cid w16 w16cex w16sdtdh w16sdtfl w16du wp14">
   <w:p>
     <w:pPr>
@@ -4666,17 +3557,7 @@
         <w:sz w:val="28"/>
         <w:szCs w:val="28"/>
       </w:rPr>
-      <w:t xml:space="preserve"> # {</w:t>
-    </w:r>
-    <w:proofErr w:type="spellStart"/>
-    <w:proofErr w:type="gramStart"/>
-    <w:r>
-      <w:rPr>
-        <w:rFonts w:ascii="BC Sans" w:eastAsia="BC Sans" w:hAnsi="BC Sans" w:cs="BC Sans"/>
-        <w:sz w:val="28"/>
-        <w:szCs w:val="28"/>
-      </w:rPr>
-      <w:t>d.</w:t>
+      <w:t xml:space="preserve"> # {d.</w:t>
     </w:r>
     <w:r>
       <w:rPr>
@@ -4684,18 +3565,8 @@
         <w:sz w:val="28"/>
         <w:szCs w:val="28"/>
       </w:rPr>
-      <w:t>invoice</w:t>
+      <w:t>invoice_num</w:t>
     </w:r>
-    <w:proofErr w:type="gramEnd"/>
-    <w:r>
-      <w:rPr>
-        <w:rFonts w:ascii="BC Sans" w:eastAsia="BC Sans" w:hAnsi="BC Sans" w:cs="BC Sans"/>
-        <w:sz w:val="28"/>
-        <w:szCs w:val="28"/>
-      </w:rPr>
-      <w:t>_num</w:t>
-    </w:r>
-    <w:proofErr w:type="spellEnd"/>
     <w:r>
       <w:rPr>
         <w:rFonts w:ascii="BC Sans" w:eastAsia="BC Sans" w:hAnsi="BC Sans" w:cs="BC Sans"/>
@@ -4704,16 +3575,6 @@
       </w:rPr>
       <w:t>}</w:t>
     </w:r>
-  </w:p>
-</w:hdr>
-</file>
-
-<file path=word/header3.xml><?xml version="1.0" encoding="utf-8"?>
-<w:hdr xmlns:wpc="http://schemas.microsoft.com/office/word/2010/wordprocessingCanvas" xmlns:cx="http://schemas.microsoft.com/office/drawing/2014/chartex" xmlns:cx1="http://schemas.microsoft.com/office/drawing/2015/9/8/chartex" xmlns:cx2="http://schemas.microsoft.com/office/drawing/2015/10/21/chartex" xmlns:cx3="http://schemas.microsoft.com/office/drawing/2016/5/9/chartex" xmlns:cx4="http://schemas.microsoft.com/office/drawing/2016/5/10/chartex" xmlns:cx5="http://schemas.microsoft.com/office/drawing/2016/5/11/chartex" xmlns:cx6="http://schemas.microsoft.com/office/drawing/2016/5/12/chartex" xmlns:cx7="http://schemas.microsoft.com/office/drawing/2016/5/13/chartex" xmlns:cx8="http://schemas.microsoft.com/office/drawing/2016/5/14/chartex" xmlns:mc="http://schemas.openxmlformats.org/markup-compatibility/2006" xmlns:aink="http://schemas.microsoft.com/office/drawing/2016/ink" xmlns:am3d="http://schemas.microsoft.com/office/drawing/2017/model3d" xmlns:o="urn:schemas-microsoft-com:office:office" xmlns:oel="http://schemas.microsoft.com/office/2019/extlst" xmlns:r="http://schemas.openxmlformats.org/officeDocument/2006/relationships" xmlns:m="http://schemas.openxmlformats.org/officeDocument/2006/math" xmlns:v="urn:schemas-microsoft-com:vml" xmlns:wp14="http://schemas.microsoft.com/office/word/2010/wordprocessingDrawing" xmlns:wp="http://schemas.openxmlformats.org/drawingml/2006/wordprocessingDrawing" xmlns:w10="urn:schemas-microsoft-com:office:word" xmlns:w="http://schemas.openxmlformats.org/wordprocessingml/2006/main" xmlns:w14="http://schemas.microsoft.com/office/word/2010/wordml" xmlns:w15="http://schemas.microsoft.com/office/word/2012/wordml" xmlns:w16cex="http://schemas.microsoft.com/office/word/2018/wordml/cex" xmlns:w16cid="http://schemas.microsoft.com/office/word/2016/wordml/cid" xmlns:w16="http://schemas.microsoft.com/office/word/2018/wordml" xmlns:w16du="http://schemas.microsoft.com/office/word/2023/wordml/word16du" xmlns:w16sdtdh="http://schemas.microsoft.com/office/word/2020/wordml/sdtdatahash" xmlns:w16sdtfl="http://schemas.microsoft.com/office/word/2024/wordml/sdtformatlock" xmlns:w16se="http://schemas.microsoft.com/office/word/2015/wordml/symex" xmlns:wpg="http://schemas.microsoft.com/office/word/2010/wordprocessingGroup" xmlns:wpi="http://schemas.microsoft.com/office/word/2010/wordprocessingInk" xmlns:wne="http://schemas.microsoft.com/office/word/2006/wordml" xmlns:wps="http://schemas.microsoft.com/office/word/2010/wordprocessingShape" mc:Ignorable="w14 w15 w16se w16cid w16 w16cex w16sdtdh w16sdtfl w16du wp14">
-  <w:p>
-    <w:pPr>
-      <w:pStyle w:val="Header"/>
-    </w:pPr>
   </w:p>
 </w:hdr>
 </file>

</xml_diff>